<commit_message>
ajuste para la generar descripcion de evidencias
</commit_message>
<xml_diff>
--- a/backend/templates/FORMATO INFORME DE ACTIVIDADES.docx
+++ b/backend/templates/FORMATO INFORME DE ACTIVIDADES.docx
@@ -1,6 +1,6 @@
 
 <file path=word/document.xml><?xml version="1.0" encoding="utf-8"?>
-<w:document xmlns:wpc="http://schemas.microsoft.com/office/word/2010/wordprocessingCanvas" xmlns:cx="http://schemas.microsoft.com/office/drawing/2014/chartex" xmlns:cx1="http://schemas.microsoft.com/office/drawing/2015/9/8/chartex" xmlns:cx2="http://schemas.microsoft.com/office/drawing/2015/10/21/chartex" xmlns:cx3="http://schemas.microsoft.com/office/drawing/2016/5/9/chartex" xmlns:cx4="http://schemas.microsoft.com/office/drawing/2016/5/10/chartex" xmlns:cx5="http://schemas.microsoft.com/office/drawing/2016/5/11/chartex" xmlns:cx6="http://schemas.microsoft.com/office/drawing/2016/5/12/chartex" xmlns:cx7="http://schemas.microsoft.com/office/drawing/2016/5/13/chartex" xmlns:cx8="http://schemas.microsoft.com/office/drawing/2016/5/14/chartex" xmlns:mc="http://schemas.openxmlformats.org/markup-compatibility/2006" xmlns:aink="http://schemas.microsoft.com/office/drawing/2016/ink" xmlns:am3d="http://schemas.microsoft.com/office/drawing/2017/model3d" xmlns:o="urn:schemas-microsoft-com:office:office" xmlns:oel="http://schemas.microsoft.com/office/2019/extlst" xmlns:r="http://schemas.openxmlformats.org/officeDocument/2006/relationships" xmlns:m="http://schemas.openxmlformats.org/officeDocument/2006/math" xmlns:v="urn:schemas-microsoft-com:vml" xmlns:wp14="http://schemas.microsoft.com/office/word/2010/wordprocessingDrawing" xmlns:wp="http://schemas.openxmlformats.org/drawingml/2006/wordprocessingDrawing" xmlns:w10="urn:schemas-microsoft-com:office:word" xmlns:w="http://schemas.openxmlformats.org/wordprocessingml/2006/main" xmlns:w14="http://schemas.microsoft.com/office/word/2010/wordml" xmlns:w15="http://schemas.microsoft.com/office/word/2012/wordml" xmlns:w16cex="http://schemas.microsoft.com/office/word/2018/wordml/cex" xmlns:w16cid="http://schemas.microsoft.com/office/word/2016/wordml/cid" xmlns:w16="http://schemas.microsoft.com/office/word/2018/wordml" xmlns:w16du="http://schemas.microsoft.com/office/word/2023/wordml/word16du" xmlns:w16sdtdh="http://schemas.microsoft.com/office/word/2020/wordml/sdtdatahash" xmlns:w16sdtfl="http://schemas.microsoft.com/office/word/2024/wordml/sdtformatlock" xmlns:w16se="http://schemas.microsoft.com/office/word/2015/wordml/symex" xmlns:wpg="http://schemas.microsoft.com/office/word/2010/wordprocessingGroup" xmlns:wpi="http://schemas.microsoft.com/office/word/2010/wordprocessingInk" xmlns:wne="http://schemas.microsoft.com/office/word/2006/wordml" xmlns:wps="http://schemas.microsoft.com/office/word/2010/wordprocessingShape" mc:Ignorable="w14 w15 w16se w16cid w16 w16cex w16sdtdh w16sdtfl w16du wp14">
+<w:document xmlns:wpc="http://schemas.microsoft.com/office/word/2010/wordprocessingCanvas" xmlns:cx="http://schemas.microsoft.com/office/drawing/2014/chartex" xmlns:cx1="http://schemas.microsoft.com/office/drawing/2015/9/8/chartex" xmlns:cx2="http://schemas.microsoft.com/office/drawing/2015/10/21/chartex" xmlns:cx3="http://schemas.microsoft.com/office/drawing/2016/5/9/chartex" xmlns:cx4="http://schemas.microsoft.com/office/drawing/2016/5/10/chartex" xmlns:cx5="http://schemas.microsoft.com/office/drawing/2016/5/11/chartex" xmlns:cx6="http://schemas.microsoft.com/office/drawing/2016/5/12/chartex" xmlns:cx7="http://schemas.microsoft.com/office/drawing/2016/5/13/chartex" xmlns:cx8="http://schemas.microsoft.com/office/drawing/2016/5/14/chartex" xmlns:mc="http://schemas.openxmlformats.org/markup-compatibility/2006" xmlns:aink="http://schemas.microsoft.com/office/drawing/2016/ink" xmlns:am3d="http://schemas.microsoft.com/office/drawing/2017/model3d" xmlns:o="urn:schemas-microsoft-com:office:office" xmlns:r="http://schemas.openxmlformats.org/officeDocument/2006/relationships" xmlns:m="http://schemas.openxmlformats.org/officeDocument/2006/math" xmlns:v="urn:schemas-microsoft-com:vml" xmlns:wp14="http://schemas.microsoft.com/office/word/2010/wordprocessingDrawing" xmlns:wp="http://schemas.openxmlformats.org/drawingml/2006/wordprocessingDrawing" xmlns:w10="urn:schemas-microsoft-com:office:word" xmlns:w="http://schemas.openxmlformats.org/wordprocessingml/2006/main" xmlns:w14="http://schemas.microsoft.com/office/word/2010/wordml" xmlns:w15="http://schemas.microsoft.com/office/word/2012/wordml" xmlns:w16cex="http://schemas.microsoft.com/office/word/2018/wordml/cex" xmlns:w16cid="http://schemas.microsoft.com/office/word/2016/wordml/cid" xmlns:w16="http://schemas.microsoft.com/office/word/2018/wordml" xmlns:w16sdtdh="http://schemas.microsoft.com/office/word/2020/wordml/sdtdatahash" xmlns:w16se="http://schemas.microsoft.com/office/word/2015/wordml/symex" xmlns:wpg="http://schemas.microsoft.com/office/word/2010/wordprocessingGroup" xmlns:wpi="http://schemas.microsoft.com/office/word/2010/wordprocessingInk" xmlns:wne="http://schemas.microsoft.com/office/word/2006/wordml" xmlns:wps="http://schemas.microsoft.com/office/word/2010/wordprocessingShape" mc:Ignorable="w14 w15 w16se w16cid w16 w16cex w16sdtdh wp14">
   <w:background w:color="FFFFFF"/>
   <w:body>
     <w:tbl>
@@ -71,42 +71,25 @@
               <w:bottom w:val="single" w:sz="4" w:space="0" w:color="000000"/>
               <w:right w:val="single" w:sz="4" w:space="0" w:color="000000"/>
             </w:tcBorders>
-            <w:vAlign w:val="center"/>
-          </w:tcPr>
-          <w:p>
-            <w:pPr>
-              <w:snapToGrid w:val="0"/>
-              <w:rPr>
-                <w:rFonts w:ascii="Arial" w:hAnsi="Arial" w:cs="Arial"/>
-                <w:sz w:val="20"/>
-                <w:szCs w:val="20"/>
-              </w:rPr>
-            </w:pPr>
-            <w:r>
-              <w:rPr>
-                <w:rFonts w:ascii="Arial" w:hAnsi="Arial" w:cs="Arial"/>
-                <w:sz w:val="20"/>
-                <w:szCs w:val="20"/>
-              </w:rPr>
-              <w:t>{{</w:t>
-            </w:r>
-            <w:proofErr w:type="spellStart"/>
-            <w:r>
-              <w:rPr>
-                <w:rFonts w:ascii="Arial" w:hAnsi="Arial" w:cs="Arial"/>
-                <w:sz w:val="20"/>
-                <w:szCs w:val="20"/>
-              </w:rPr>
-              <w:t>numero_contrato</w:t>
-            </w:r>
-            <w:proofErr w:type="spellEnd"/>
-            <w:r>
-              <w:rPr>
-                <w:rFonts w:ascii="Arial" w:hAnsi="Arial" w:cs="Arial"/>
-                <w:sz w:val="20"/>
-                <w:szCs w:val="20"/>
-              </w:rPr>
-              <w:t>}}</w:t>
+            <w:shd w:val="clear" w:color="auto" w:fill="auto"/>
+            <w:vAlign w:val="center"/>
+          </w:tcPr>
+          <w:p>
+            <w:pPr>
+              <w:snapToGrid w:val="0"/>
+              <w:rPr>
+                <w:rFonts w:ascii="Arial" w:hAnsi="Arial" w:cs="Arial"/>
+                <w:sz w:val="20"/>
+                <w:szCs w:val="20"/>
+              </w:rPr>
+            </w:pPr>
+            <w:r>
+              <w:rPr>
+                <w:rFonts w:ascii="Arial" w:hAnsi="Arial" w:cs="Arial"/>
+                <w:sz w:val="20"/>
+                <w:szCs w:val="20"/>
+              </w:rPr>
+              <w:t xml:space="preserve">{{numero_contrato}}</w:t>
             </w:r>
           </w:p>
         </w:tc>
@@ -160,42 +143,25 @@
               <w:bottom w:val="single" w:sz="4" w:space="0" w:color="000000"/>
               <w:right w:val="single" w:sz="4" w:space="0" w:color="000000"/>
             </w:tcBorders>
-            <w:vAlign w:val="center"/>
-          </w:tcPr>
-          <w:p>
-            <w:pPr>
-              <w:snapToGrid w:val="0"/>
-              <w:rPr>
-                <w:rFonts w:ascii="Arial" w:hAnsi="Arial" w:cs="Arial"/>
-                <w:sz w:val="20"/>
-                <w:szCs w:val="20"/>
-              </w:rPr>
-            </w:pPr>
-            <w:r>
-              <w:rPr>
-                <w:rFonts w:ascii="Arial" w:hAnsi="Arial" w:cs="Arial"/>
-                <w:sz w:val="20"/>
-                <w:szCs w:val="20"/>
-              </w:rPr>
-              <w:t>{{</w:t>
-            </w:r>
-            <w:proofErr w:type="spellStart"/>
-            <w:r>
-              <w:rPr>
-                <w:rFonts w:ascii="Arial" w:hAnsi="Arial" w:cs="Arial"/>
-                <w:sz w:val="20"/>
-                <w:szCs w:val="20"/>
-              </w:rPr>
-              <w:t>objeto_contrato</w:t>
-            </w:r>
-            <w:proofErr w:type="spellEnd"/>
-            <w:r>
-              <w:rPr>
-                <w:rFonts w:ascii="Arial" w:hAnsi="Arial" w:cs="Arial"/>
-                <w:sz w:val="20"/>
-                <w:szCs w:val="20"/>
-              </w:rPr>
-              <w:t>}}</w:t>
+            <w:shd w:val="clear" w:color="auto" w:fill="auto"/>
+            <w:vAlign w:val="center"/>
+          </w:tcPr>
+          <w:p>
+            <w:pPr>
+              <w:snapToGrid w:val="0"/>
+              <w:rPr>
+                <w:rFonts w:ascii="Arial" w:hAnsi="Arial" w:cs="Arial"/>
+                <w:sz w:val="20"/>
+                <w:szCs w:val="20"/>
+              </w:rPr>
+            </w:pPr>
+            <w:r>
+              <w:rPr>
+                <w:rFonts w:ascii="Arial" w:hAnsi="Arial" w:cs="Arial"/>
+                <w:sz w:val="20"/>
+                <w:szCs w:val="20"/>
+              </w:rPr>
+              <w:t xml:space="preserve">{{objeto_contrato}}</w:t>
             </w:r>
           </w:p>
         </w:tc>
@@ -212,6 +178,7 @@
               <w:left w:val="single" w:sz="4" w:space="0" w:color="000000"/>
               <w:bottom w:val="single" w:sz="4" w:space="0" w:color="000000"/>
             </w:tcBorders>
+            <w:shd w:val="clear" w:color="auto" w:fill="auto"/>
             <w:vAlign w:val="center"/>
           </w:tcPr>
           <w:p>
@@ -238,6 +205,7 @@
               <w:bottom w:val="single" w:sz="4" w:space="0" w:color="000000"/>
               <w:right w:val="single" w:sz="4" w:space="0" w:color="000000"/>
             </w:tcBorders>
+            <w:shd w:val="clear" w:color="auto" w:fill="auto"/>
             <w:vAlign w:val="center"/>
           </w:tcPr>
           <w:p>
@@ -264,6 +232,7 @@
               <w:left w:val="single" w:sz="4" w:space="0" w:color="000000"/>
               <w:bottom w:val="single" w:sz="4" w:space="0" w:color="000000"/>
             </w:tcBorders>
+            <w:shd w:val="clear" w:color="auto" w:fill="auto"/>
             <w:vAlign w:val="center"/>
           </w:tcPr>
           <w:p>
@@ -290,6 +259,7 @@
               <w:bottom w:val="single" w:sz="4" w:space="0" w:color="000000"/>
               <w:right w:val="single" w:sz="4" w:space="0" w:color="000000"/>
             </w:tcBorders>
+            <w:shd w:val="clear" w:color="auto" w:fill="auto"/>
             <w:vAlign w:val="center"/>
           </w:tcPr>
           <w:p>
@@ -350,42 +320,25 @@
               <w:left w:val="single" w:sz="4" w:space="0" w:color="000000"/>
               <w:bottom w:val="single" w:sz="4" w:space="0" w:color="000000"/>
             </w:tcBorders>
-            <w:vAlign w:val="center"/>
-          </w:tcPr>
-          <w:p>
-            <w:pPr>
-              <w:snapToGrid w:val="0"/>
-              <w:rPr>
-                <w:rFonts w:ascii="Arial" w:hAnsi="Arial" w:cs="Arial"/>
-                <w:sz w:val="20"/>
-                <w:szCs w:val="20"/>
-              </w:rPr>
-            </w:pPr>
-            <w:r>
-              <w:rPr>
-                <w:rFonts w:ascii="Arial" w:hAnsi="Arial" w:cs="Arial"/>
-                <w:sz w:val="20"/>
-                <w:szCs w:val="20"/>
-              </w:rPr>
-              <w:t>$ {{</w:t>
-            </w:r>
-            <w:proofErr w:type="spellStart"/>
-            <w:r>
-              <w:rPr>
-                <w:rFonts w:ascii="Arial" w:hAnsi="Arial" w:cs="Arial"/>
-                <w:sz w:val="20"/>
-                <w:szCs w:val="20"/>
-              </w:rPr>
-              <w:t>valor_total</w:t>
-            </w:r>
-            <w:proofErr w:type="spellEnd"/>
-            <w:r>
-              <w:rPr>
-                <w:rFonts w:ascii="Arial" w:hAnsi="Arial" w:cs="Arial"/>
-                <w:sz w:val="20"/>
-                <w:szCs w:val="20"/>
-              </w:rPr>
-              <w:t>}}</w:t>
+            <w:shd w:val="clear" w:color="auto" w:fill="auto"/>
+            <w:vAlign w:val="center"/>
+          </w:tcPr>
+          <w:p>
+            <w:pPr>
+              <w:snapToGrid w:val="0"/>
+              <w:rPr>
+                <w:rFonts w:ascii="Arial" w:hAnsi="Arial" w:cs="Arial"/>
+                <w:sz w:val="20"/>
+                <w:szCs w:val="20"/>
+              </w:rPr>
+            </w:pPr>
+            <w:r>
+              <w:rPr>
+                <w:rFonts w:ascii="Arial" w:hAnsi="Arial" w:cs="Arial"/>
+                <w:sz w:val="20"/>
+                <w:szCs w:val="20"/>
+              </w:rPr>
+              <w:t xml:space="preserve">$ {{valor_total}}</w:t>
             </w:r>
           </w:p>
         </w:tc>
@@ -433,6 +386,7 @@
               <w:bottom w:val="single" w:sz="4" w:space="0" w:color="000000"/>
               <w:right w:val="single" w:sz="4" w:space="0" w:color="000000"/>
             </w:tcBorders>
+            <w:shd w:val="clear" w:color="auto" w:fill="auto"/>
             <w:vAlign w:val="center"/>
           </w:tcPr>
           <w:p>
@@ -451,25 +405,7 @@
                 <w:sz w:val="20"/>
                 <w:szCs w:val="20"/>
               </w:rPr>
-              <w:t>{{</w:t>
-            </w:r>
-            <w:proofErr w:type="spellStart"/>
-            <w:r>
-              <w:rPr>
-                <w:rFonts w:ascii="Arial" w:hAnsi="Arial" w:cs="Arial"/>
-                <w:sz w:val="20"/>
-                <w:szCs w:val="20"/>
-              </w:rPr>
-              <w:t>rp</w:t>
-            </w:r>
-            <w:proofErr w:type="spellEnd"/>
-            <w:r>
-              <w:rPr>
-                <w:rFonts w:ascii="Arial" w:hAnsi="Arial" w:cs="Arial"/>
-                <w:sz w:val="20"/>
-                <w:szCs w:val="20"/>
-              </w:rPr>
-              <w:t>}}</w:t>
+              <w:t xml:space="preserve">{{rp}}</w:t>
             </w:r>
           </w:p>
         </w:tc>
@@ -522,42 +458,25 @@
               <w:bottom w:val="single" w:sz="4" w:space="0" w:color="000000"/>
               <w:right w:val="single" w:sz="4" w:space="0" w:color="000000"/>
             </w:tcBorders>
-            <w:vAlign w:val="center"/>
-          </w:tcPr>
-          <w:p>
-            <w:pPr>
-              <w:snapToGrid w:val="0"/>
-              <w:rPr>
-                <w:rFonts w:ascii="Arial" w:hAnsi="Arial" w:cs="Arial"/>
-                <w:sz w:val="20"/>
-                <w:szCs w:val="20"/>
-              </w:rPr>
-            </w:pPr>
-            <w:r>
-              <w:rPr>
-                <w:rFonts w:ascii="Arial" w:hAnsi="Arial" w:cs="Arial"/>
-                <w:sz w:val="20"/>
-                <w:szCs w:val="20"/>
-              </w:rPr>
-              <w:t>{{</w:t>
-            </w:r>
-            <w:proofErr w:type="spellStart"/>
-            <w:r>
-              <w:rPr>
-                <w:rFonts w:ascii="Arial" w:hAnsi="Arial" w:cs="Arial"/>
-                <w:sz w:val="20"/>
-                <w:szCs w:val="20"/>
-              </w:rPr>
-              <w:t>nombre_contratista</w:t>
-            </w:r>
-            <w:proofErr w:type="spellEnd"/>
-            <w:r>
-              <w:rPr>
-                <w:rFonts w:ascii="Arial" w:hAnsi="Arial" w:cs="Arial"/>
-                <w:sz w:val="20"/>
-                <w:szCs w:val="20"/>
-              </w:rPr>
-              <w:t>}}</w:t>
+            <w:shd w:val="clear" w:color="auto" w:fill="auto"/>
+            <w:vAlign w:val="center"/>
+          </w:tcPr>
+          <w:p>
+            <w:pPr>
+              <w:snapToGrid w:val="0"/>
+              <w:rPr>
+                <w:rFonts w:ascii="Arial" w:hAnsi="Arial" w:cs="Arial"/>
+                <w:sz w:val="20"/>
+                <w:szCs w:val="20"/>
+              </w:rPr>
+            </w:pPr>
+            <w:r>
+              <w:rPr>
+                <w:rFonts w:ascii="Arial" w:hAnsi="Arial" w:cs="Arial"/>
+                <w:sz w:val="20"/>
+                <w:szCs w:val="20"/>
+              </w:rPr>
+              <w:t xml:space="preserve">{{nombre_contratista}}</w:t>
             </w:r>
           </w:p>
         </w:tc>
@@ -610,42 +529,25 @@
               <w:bottom w:val="single" w:sz="4" w:space="0" w:color="000000"/>
               <w:right w:val="single" w:sz="4" w:space="0" w:color="000000"/>
             </w:tcBorders>
-            <w:vAlign w:val="center"/>
-          </w:tcPr>
-          <w:p>
-            <w:pPr>
-              <w:snapToGrid w:val="0"/>
-              <w:rPr>
-                <w:rFonts w:ascii="Arial" w:hAnsi="Arial" w:cs="Arial"/>
-                <w:sz w:val="20"/>
-                <w:szCs w:val="20"/>
-              </w:rPr>
-            </w:pPr>
-            <w:r>
-              <w:rPr>
-                <w:rFonts w:ascii="Arial" w:hAnsi="Arial" w:cs="Arial"/>
-                <w:sz w:val="20"/>
-                <w:szCs w:val="20"/>
-              </w:rPr>
-              <w:t>{{</w:t>
-            </w:r>
-            <w:proofErr w:type="spellStart"/>
-            <w:r>
-              <w:rPr>
-                <w:rFonts w:ascii="Arial" w:hAnsi="Arial" w:cs="Arial"/>
-                <w:sz w:val="20"/>
-                <w:szCs w:val="20"/>
-              </w:rPr>
-              <w:t>nombre_supervisor</w:t>
-            </w:r>
-            <w:proofErr w:type="spellEnd"/>
-            <w:r>
-              <w:rPr>
-                <w:rFonts w:ascii="Arial" w:hAnsi="Arial" w:cs="Arial"/>
-                <w:sz w:val="20"/>
-                <w:szCs w:val="20"/>
-              </w:rPr>
-              <w:t>}}</w:t>
+            <w:shd w:val="clear" w:color="auto" w:fill="auto"/>
+            <w:vAlign w:val="center"/>
+          </w:tcPr>
+          <w:p>
+            <w:pPr>
+              <w:snapToGrid w:val="0"/>
+              <w:rPr>
+                <w:rFonts w:ascii="Arial" w:hAnsi="Arial" w:cs="Arial"/>
+                <w:sz w:val="20"/>
+                <w:szCs w:val="20"/>
+              </w:rPr>
+            </w:pPr>
+            <w:r>
+              <w:rPr>
+                <w:rFonts w:ascii="Arial" w:hAnsi="Arial" w:cs="Arial"/>
+                <w:sz w:val="20"/>
+                <w:szCs w:val="20"/>
+              </w:rPr>
+              <w:t xml:space="preserve">{{nombre_supervisor}}</w:t>
             </w:r>
           </w:p>
         </w:tc>
@@ -698,42 +600,25 @@
               <w:bottom w:val="single" w:sz="4" w:space="0" w:color="000000"/>
               <w:right w:val="single" w:sz="4" w:space="0" w:color="000000"/>
             </w:tcBorders>
-            <w:vAlign w:val="center"/>
-          </w:tcPr>
-          <w:p>
-            <w:pPr>
-              <w:snapToGrid w:val="0"/>
-              <w:rPr>
-                <w:rFonts w:ascii="Arial" w:hAnsi="Arial" w:cs="Arial"/>
-                <w:sz w:val="20"/>
-                <w:szCs w:val="20"/>
-              </w:rPr>
-            </w:pPr>
-            <w:r>
-              <w:rPr>
-                <w:rFonts w:ascii="Arial" w:hAnsi="Arial" w:cs="Arial"/>
-                <w:sz w:val="20"/>
-                <w:szCs w:val="20"/>
-              </w:rPr>
-              <w:t>{{</w:t>
-            </w:r>
-            <w:proofErr w:type="spellStart"/>
-            <w:r>
-              <w:rPr>
-                <w:rFonts w:ascii="Arial" w:hAnsi="Arial" w:cs="Arial"/>
-                <w:sz w:val="20"/>
-                <w:szCs w:val="20"/>
-              </w:rPr>
-              <w:t>fecha_acta_inicio</w:t>
-            </w:r>
-            <w:proofErr w:type="spellEnd"/>
-            <w:r>
-              <w:rPr>
-                <w:rFonts w:ascii="Arial" w:hAnsi="Arial" w:cs="Arial"/>
-                <w:sz w:val="20"/>
-                <w:szCs w:val="20"/>
-              </w:rPr>
-              <w:t>}}</w:t>
+            <w:shd w:val="clear" w:color="auto" w:fill="auto"/>
+            <w:vAlign w:val="center"/>
+          </w:tcPr>
+          <w:p>
+            <w:pPr>
+              <w:snapToGrid w:val="0"/>
+              <w:rPr>
+                <w:rFonts w:ascii="Arial" w:hAnsi="Arial" w:cs="Arial"/>
+                <w:sz w:val="20"/>
+                <w:szCs w:val="20"/>
+              </w:rPr>
+            </w:pPr>
+            <w:r>
+              <w:rPr>
+                <w:rFonts w:ascii="Arial" w:hAnsi="Arial" w:cs="Arial"/>
+                <w:sz w:val="20"/>
+                <w:szCs w:val="20"/>
+              </w:rPr>
+              <w:t xml:space="preserve">{{fecha_acta_inicio}}</w:t>
             </w:r>
           </w:p>
         </w:tc>
@@ -786,42 +671,25 @@
               <w:bottom w:val="single" w:sz="4" w:space="0" w:color="000000"/>
               <w:right w:val="single" w:sz="4" w:space="0" w:color="000000"/>
             </w:tcBorders>
-            <w:vAlign w:val="center"/>
-          </w:tcPr>
-          <w:p>
-            <w:pPr>
-              <w:snapToGrid w:val="0"/>
-              <w:rPr>
-                <w:rFonts w:ascii="Arial" w:hAnsi="Arial" w:cs="Arial"/>
-                <w:sz w:val="20"/>
-                <w:szCs w:val="20"/>
-              </w:rPr>
-            </w:pPr>
-            <w:r>
-              <w:rPr>
-                <w:rFonts w:ascii="Arial" w:hAnsi="Arial" w:cs="Arial"/>
-                <w:sz w:val="20"/>
-                <w:szCs w:val="20"/>
-              </w:rPr>
-              <w:t>{{</w:t>
-            </w:r>
-            <w:proofErr w:type="spellStart"/>
-            <w:r>
-              <w:rPr>
-                <w:rFonts w:ascii="Arial" w:hAnsi="Arial" w:cs="Arial"/>
-                <w:sz w:val="20"/>
-                <w:szCs w:val="20"/>
-              </w:rPr>
-              <w:t>fecha_terminacion</w:t>
-            </w:r>
-            <w:proofErr w:type="spellEnd"/>
-            <w:r>
-              <w:rPr>
-                <w:rFonts w:ascii="Arial" w:hAnsi="Arial" w:cs="Arial"/>
-                <w:sz w:val="20"/>
-                <w:szCs w:val="20"/>
-              </w:rPr>
-              <w:t>}}</w:t>
+            <w:shd w:val="clear" w:color="auto" w:fill="auto"/>
+            <w:vAlign w:val="center"/>
+          </w:tcPr>
+          <w:p>
+            <w:pPr>
+              <w:snapToGrid w:val="0"/>
+              <w:rPr>
+                <w:rFonts w:ascii="Arial" w:hAnsi="Arial" w:cs="Arial"/>
+                <w:sz w:val="20"/>
+                <w:szCs w:val="20"/>
+              </w:rPr>
+            </w:pPr>
+            <w:r>
+              <w:rPr>
+                <w:rFonts w:ascii="Arial" w:hAnsi="Arial" w:cs="Arial"/>
+                <w:sz w:val="20"/>
+                <w:szCs w:val="20"/>
+              </w:rPr>
+              <w:t xml:space="preserve">{{fecha_terminacion}}</w:t>
             </w:r>
           </w:p>
         </w:tc>
@@ -876,42 +744,25 @@
               <w:bottom w:val="single" w:sz="4" w:space="0" w:color="000000"/>
               <w:right w:val="single" w:sz="4" w:space="0" w:color="000000"/>
             </w:tcBorders>
-            <w:vAlign w:val="center"/>
-          </w:tcPr>
-          <w:p>
-            <w:pPr>
-              <w:snapToGrid w:val="0"/>
-              <w:rPr>
-                <w:rFonts w:ascii="Arial" w:hAnsi="Arial" w:cs="Arial"/>
-                <w:sz w:val="20"/>
-                <w:szCs w:val="20"/>
-              </w:rPr>
-            </w:pPr>
-            <w:r>
-              <w:rPr>
-                <w:rFonts w:ascii="Arial" w:hAnsi="Arial" w:cs="Arial"/>
-                <w:sz w:val="20"/>
-                <w:szCs w:val="20"/>
-              </w:rPr>
-              <w:t>{{</w:t>
-            </w:r>
-            <w:proofErr w:type="spellStart"/>
-            <w:r>
-              <w:rPr>
-                <w:rFonts w:ascii="Arial" w:hAnsi="Arial" w:cs="Arial"/>
-                <w:sz w:val="20"/>
-                <w:szCs w:val="20"/>
-              </w:rPr>
-              <w:t>plazo_ejecucion</w:t>
-            </w:r>
-            <w:proofErr w:type="spellEnd"/>
-            <w:r>
-              <w:rPr>
-                <w:rFonts w:ascii="Arial" w:hAnsi="Arial" w:cs="Arial"/>
-                <w:sz w:val="20"/>
-                <w:szCs w:val="20"/>
-              </w:rPr>
-              <w:t>}}</w:t>
+            <w:shd w:val="clear" w:color="auto" w:fill="auto"/>
+            <w:vAlign w:val="center"/>
+          </w:tcPr>
+          <w:p>
+            <w:pPr>
+              <w:snapToGrid w:val="0"/>
+              <w:rPr>
+                <w:rFonts w:ascii="Arial" w:hAnsi="Arial" w:cs="Arial"/>
+                <w:sz w:val="20"/>
+                <w:szCs w:val="20"/>
+              </w:rPr>
+            </w:pPr>
+            <w:r>
+              <w:rPr>
+                <w:rFonts w:ascii="Arial" w:hAnsi="Arial" w:cs="Arial"/>
+                <w:sz w:val="20"/>
+                <w:szCs w:val="20"/>
+              </w:rPr>
+              <w:t xml:space="preserve">{{plazo_ejecucion}}</w:t>
             </w:r>
           </w:p>
         </w:tc>
@@ -966,42 +817,25 @@
               <w:bottom w:val="single" w:sz="4" w:space="0" w:color="000000"/>
               <w:right w:val="single" w:sz="4" w:space="0" w:color="000000"/>
             </w:tcBorders>
-            <w:vAlign w:val="center"/>
-          </w:tcPr>
-          <w:p>
-            <w:pPr>
-              <w:snapToGrid w:val="0"/>
-              <w:rPr>
-                <w:rFonts w:ascii="Arial" w:hAnsi="Arial" w:cs="Arial"/>
-                <w:sz w:val="20"/>
-                <w:szCs w:val="20"/>
-              </w:rPr>
-            </w:pPr>
-            <w:r>
-              <w:rPr>
-                <w:rFonts w:ascii="Arial" w:hAnsi="Arial" w:cs="Arial"/>
-                <w:sz w:val="20"/>
-                <w:szCs w:val="20"/>
-              </w:rPr>
-              <w:t>{{</w:t>
-            </w:r>
-            <w:proofErr w:type="spellStart"/>
-            <w:r>
-              <w:rPr>
-                <w:rFonts w:ascii="Arial" w:hAnsi="Arial" w:cs="Arial"/>
-                <w:sz w:val="20"/>
-                <w:szCs w:val="20"/>
-              </w:rPr>
-              <w:t>forma_pago</w:t>
-            </w:r>
-            <w:proofErr w:type="spellEnd"/>
-            <w:r>
-              <w:rPr>
-                <w:rFonts w:ascii="Arial" w:hAnsi="Arial" w:cs="Arial"/>
-                <w:sz w:val="20"/>
-                <w:szCs w:val="20"/>
-              </w:rPr>
-              <w:t>}}</w:t>
+            <w:shd w:val="clear" w:color="auto" w:fill="auto"/>
+            <w:vAlign w:val="center"/>
+          </w:tcPr>
+          <w:p>
+            <w:pPr>
+              <w:snapToGrid w:val="0"/>
+              <w:rPr>
+                <w:rFonts w:ascii="Arial" w:hAnsi="Arial" w:cs="Arial"/>
+                <w:sz w:val="20"/>
+                <w:szCs w:val="20"/>
+              </w:rPr>
+            </w:pPr>
+            <w:r>
+              <w:rPr>
+                <w:rFonts w:ascii="Arial" w:hAnsi="Arial" w:cs="Arial"/>
+                <w:sz w:val="20"/>
+                <w:szCs w:val="20"/>
+              </w:rPr>
+              <w:t xml:space="preserve">{{forma_pago}}</w:t>
             </w:r>
           </w:p>
         </w:tc>
@@ -1020,6 +854,7 @@
               <w:left w:val="single" w:sz="4" w:space="0" w:color="000000"/>
               <w:bottom w:val="single" w:sz="4" w:space="0" w:color="000000"/>
             </w:tcBorders>
+            <w:shd w:val="clear" w:color="auto" w:fill="auto"/>
             <w:vAlign w:val="center"/>
           </w:tcPr>
           <w:p>
@@ -1164,6 +999,7 @@
               <w:left w:val="single" w:sz="4" w:space="0" w:color="000000"/>
               <w:bottom w:val="single" w:sz="4" w:space="0" w:color="000000"/>
             </w:tcBorders>
+            <w:shd w:val="clear" w:color="auto" w:fill="auto"/>
             <w:vAlign w:val="center"/>
           </w:tcPr>
           <w:p>
@@ -1185,6 +1021,7 @@
             <w:tcBorders>
               <w:left w:val="single" w:sz="4" w:space="0" w:color="000000"/>
             </w:tcBorders>
+            <w:shd w:val="clear" w:color="auto" w:fill="auto"/>
             <w:vAlign w:val="bottom"/>
           </w:tcPr>
           <w:p>
@@ -1202,25 +1039,7 @@
                 <w:sz w:val="20"/>
                 <w:szCs w:val="20"/>
               </w:rPr>
-              <w:t>{{</w:t>
-            </w:r>
-            <w:proofErr w:type="spellStart"/>
-            <w:r>
-              <w:rPr>
-                <w:rFonts w:ascii="Arial" w:hAnsi="Arial" w:cs="Arial"/>
-                <w:sz w:val="20"/>
-                <w:szCs w:val="20"/>
-              </w:rPr>
-              <w:t>acta_parcial_anio</w:t>
-            </w:r>
-            <w:proofErr w:type="spellEnd"/>
-            <w:r>
-              <w:rPr>
-                <w:rFonts w:ascii="Arial" w:hAnsi="Arial" w:cs="Arial"/>
-                <w:sz w:val="20"/>
-                <w:szCs w:val="20"/>
-              </w:rPr>
-              <w:t>}}</w:t>
+              <w:t xml:space="preserve">{{acta_parcial_anio}}</w:t>
             </w:r>
           </w:p>
         </w:tc>
@@ -1230,6 +1049,7 @@
             <w:tcBorders>
               <w:left w:val="single" w:sz="4" w:space="0" w:color="000000"/>
             </w:tcBorders>
+            <w:shd w:val="clear" w:color="auto" w:fill="auto"/>
             <w:vAlign w:val="bottom"/>
           </w:tcPr>
           <w:p>
@@ -1247,25 +1067,7 @@
                 <w:sz w:val="20"/>
                 <w:szCs w:val="20"/>
               </w:rPr>
-              <w:t>{{</w:t>
-            </w:r>
-            <w:proofErr w:type="spellStart"/>
-            <w:r>
-              <w:rPr>
-                <w:rFonts w:ascii="Arial" w:hAnsi="Arial" w:cs="Arial"/>
-                <w:sz w:val="20"/>
-                <w:szCs w:val="20"/>
-              </w:rPr>
-              <w:t>acta_parcial_mes</w:t>
-            </w:r>
-            <w:proofErr w:type="spellEnd"/>
-            <w:r>
-              <w:rPr>
-                <w:rFonts w:ascii="Arial" w:hAnsi="Arial" w:cs="Arial"/>
-                <w:sz w:val="20"/>
-                <w:szCs w:val="20"/>
-              </w:rPr>
-              <w:t>}}</w:t>
+              <w:t xml:space="preserve">{{acta_parcial_mes}}</w:t>
             </w:r>
           </w:p>
         </w:tc>
@@ -1276,6 +1078,7 @@
               <w:left w:val="single" w:sz="4" w:space="0" w:color="000000"/>
               <w:right w:val="single" w:sz="4" w:space="0" w:color="000000"/>
             </w:tcBorders>
+            <w:shd w:val="clear" w:color="auto" w:fill="auto"/>
             <w:vAlign w:val="bottom"/>
           </w:tcPr>
           <w:p>
@@ -1293,25 +1096,7 @@
                 <w:sz w:val="20"/>
                 <w:szCs w:val="20"/>
               </w:rPr>
-              <w:t>{{</w:t>
-            </w:r>
-            <w:proofErr w:type="spellStart"/>
-            <w:r>
-              <w:rPr>
-                <w:rFonts w:ascii="Arial" w:hAnsi="Arial" w:cs="Arial"/>
-                <w:sz w:val="20"/>
-                <w:szCs w:val="20"/>
-              </w:rPr>
-              <w:t>acta_parcial_dia</w:t>
-            </w:r>
-            <w:proofErr w:type="spellEnd"/>
-            <w:r>
-              <w:rPr>
-                <w:rFonts w:ascii="Arial" w:hAnsi="Arial" w:cs="Arial"/>
-                <w:sz w:val="20"/>
-                <w:szCs w:val="20"/>
-              </w:rPr>
-              <w:t>}}</w:t>
+              <w:t xml:space="preserve">{{acta_parcial_dia}}</w:t>
             </w:r>
           </w:p>
         </w:tc>
@@ -1330,6 +1115,7 @@
               <w:left w:val="single" w:sz="4" w:space="0" w:color="000000"/>
               <w:right w:val="single" w:sz="4" w:space="0" w:color="000000"/>
             </w:tcBorders>
+            <w:shd w:val="clear" w:color="auto" w:fill="auto"/>
             <w:vAlign w:val="center"/>
           </w:tcPr>
           <w:p>
@@ -1348,43 +1134,7 @@
                 <w:sz w:val="20"/>
                 <w:szCs w:val="20"/>
               </w:rPr>
-              <w:t>En la ciudad de Armenia Q.</w:t>
-            </w:r>
-            <w:proofErr w:type="gramStart"/>
-            <w:r>
-              <w:rPr>
-                <w:rFonts w:ascii="Arial" w:hAnsi="Arial" w:cs="Arial"/>
-                <w:sz w:val="20"/>
-                <w:szCs w:val="20"/>
-              </w:rPr>
-              <w:t>,  en</w:t>
-            </w:r>
-            <w:proofErr w:type="gramEnd"/>
-            <w:r>
-              <w:rPr>
-                <w:rFonts w:ascii="Arial" w:hAnsi="Arial" w:cs="Arial"/>
-                <w:sz w:val="20"/>
-                <w:szCs w:val="20"/>
-              </w:rPr>
-              <w:t xml:space="preserve"> la fecha antes indicada contratista y supervisor suscriben la presente Acta Parcial No. {{</w:t>
-            </w:r>
-            <w:proofErr w:type="spellStart"/>
-            <w:r>
-              <w:rPr>
-                <w:rFonts w:ascii="Arial" w:hAnsi="Arial" w:cs="Arial"/>
-                <w:sz w:val="20"/>
-                <w:szCs w:val="20"/>
-              </w:rPr>
-              <w:t>numero_acta_parcial</w:t>
-            </w:r>
-            <w:proofErr w:type="spellEnd"/>
-            <w:r>
-              <w:rPr>
-                <w:rFonts w:ascii="Arial" w:hAnsi="Arial" w:cs="Arial"/>
-                <w:sz w:val="20"/>
-                <w:szCs w:val="20"/>
-              </w:rPr>
-              <w:t>}} del contrato antes identificado y autorizar su correspondiente pago.</w:t>
+              <w:t xml:space="preserve">En la ciudad de Armenia Q.,  en la fecha antes indicada contratista y supervisor suscriben la presente Acta Parcial No. {{numero_acta_parcial}} del contrato antes identificado y autorizar su correspondiente pago.</w:t>
             </w:r>
           </w:p>
         </w:tc>
@@ -1403,6 +1153,7 @@
               <w:left w:val="single" w:sz="4" w:space="0" w:color="000000"/>
               <w:right w:val="single" w:sz="4" w:space="0" w:color="000000"/>
             </w:tcBorders>
+            <w:shd w:val="clear" w:color="auto" w:fill="auto"/>
             <w:vAlign w:val="center"/>
           </w:tcPr>
           <w:p>
@@ -1466,6 +1217,7 @@
               <w:bottom w:val="single" w:sz="4" w:space="0" w:color="000000"/>
               <w:right w:val="single" w:sz="4" w:space="0" w:color="000000"/>
             </w:tcBorders>
+            <w:shd w:val="clear" w:color="auto" w:fill="auto"/>
             <w:vAlign w:val="bottom"/>
           </w:tcPr>
           <w:p>
@@ -1483,43 +1235,7 @@
                 <w:sz w:val="20"/>
                 <w:szCs w:val="20"/>
               </w:rPr>
-              <w:t>Del {{</w:t>
-            </w:r>
-            <w:proofErr w:type="spellStart"/>
-            <w:r>
-              <w:rPr>
-                <w:rFonts w:ascii="Arial" w:hAnsi="Arial" w:cs="Arial"/>
-                <w:sz w:val="20"/>
-                <w:szCs w:val="20"/>
-              </w:rPr>
-              <w:t>periodo_informado_inicio</w:t>
-            </w:r>
-            <w:proofErr w:type="spellEnd"/>
-            <w:r>
-              <w:rPr>
-                <w:rFonts w:ascii="Arial" w:hAnsi="Arial" w:cs="Arial"/>
-                <w:sz w:val="20"/>
-                <w:szCs w:val="20"/>
-              </w:rPr>
-              <w:t>}} al {{</w:t>
-            </w:r>
-            <w:proofErr w:type="spellStart"/>
-            <w:r>
-              <w:rPr>
-                <w:rFonts w:ascii="Arial" w:hAnsi="Arial" w:cs="Arial"/>
-                <w:sz w:val="20"/>
-                <w:szCs w:val="20"/>
-              </w:rPr>
-              <w:t>periodo_informado_fin</w:t>
-            </w:r>
-            <w:proofErr w:type="spellEnd"/>
-            <w:r>
-              <w:rPr>
-                <w:rFonts w:ascii="Arial" w:hAnsi="Arial" w:cs="Arial"/>
-                <w:sz w:val="20"/>
-                <w:szCs w:val="20"/>
-              </w:rPr>
-              <w:t>}}.</w:t>
+              <w:t xml:space="preserve">Del {{periodo_informado_inicio}} al {{periodo_informado_fin}}.</w:t>
             </w:r>
           </w:p>
         </w:tc>
@@ -1572,6 +1288,7 @@
               <w:bottom w:val="single" w:sz="4" w:space="0" w:color="000000"/>
               <w:right w:val="single" w:sz="4" w:space="0" w:color="000000"/>
             </w:tcBorders>
+            <w:shd w:val="clear" w:color="auto" w:fill="auto"/>
             <w:vAlign w:val="bottom"/>
           </w:tcPr>
           <w:p>
@@ -1594,25 +1311,7 @@
                 <w:sz w:val="20"/>
                 <w:szCs w:val="20"/>
               </w:rPr>
-              <w:t>{{</w:t>
-            </w:r>
-            <w:proofErr w:type="spellStart"/>
-            <w:r>
-              <w:rPr>
-                <w:rFonts w:ascii="Arial" w:hAnsi="Arial" w:cs="Arial"/>
-                <w:sz w:val="20"/>
-                <w:szCs w:val="20"/>
-              </w:rPr>
-              <w:t>actividades_desarrolladas</w:t>
-            </w:r>
-            <w:proofErr w:type="spellEnd"/>
-            <w:r>
-              <w:rPr>
-                <w:rFonts w:ascii="Arial" w:hAnsi="Arial" w:cs="Arial"/>
-                <w:sz w:val="20"/>
-                <w:szCs w:val="20"/>
-              </w:rPr>
-              <w:t>}}</w:t>
+              <w:t xml:space="preserve">{{actividades_desarrolladas}}</w:t>
             </w:r>
           </w:p>
         </w:tc>
@@ -1665,42 +1364,25 @@
               <w:bottom w:val="single" w:sz="4" w:space="0" w:color="000000"/>
               <w:right w:val="single" w:sz="4" w:space="0" w:color="000000"/>
             </w:tcBorders>
-            <w:vAlign w:val="center"/>
-          </w:tcPr>
-          <w:p>
-            <w:pPr>
-              <w:snapToGrid w:val="0"/>
-              <w:rPr>
-                <w:rFonts w:ascii="Arial" w:hAnsi="Arial" w:cs="Arial"/>
-                <w:sz w:val="20"/>
-                <w:szCs w:val="20"/>
-              </w:rPr>
-            </w:pPr>
-            <w:r>
-              <w:rPr>
-                <w:rFonts w:ascii="Arial" w:hAnsi="Arial" w:cs="Arial"/>
-                <w:sz w:val="20"/>
-                <w:szCs w:val="20"/>
-              </w:rPr>
-              <w:t>{{</w:t>
-            </w:r>
-            <w:proofErr w:type="spellStart"/>
-            <w:r>
-              <w:rPr>
-                <w:rFonts w:ascii="Arial" w:hAnsi="Arial" w:cs="Arial"/>
-                <w:sz w:val="20"/>
-                <w:szCs w:val="20"/>
-              </w:rPr>
-              <w:t>evidencias_ejecucion</w:t>
-            </w:r>
-            <w:proofErr w:type="spellEnd"/>
-            <w:r>
-              <w:rPr>
-                <w:rFonts w:ascii="Arial" w:hAnsi="Arial" w:cs="Arial"/>
-                <w:sz w:val="20"/>
-                <w:szCs w:val="20"/>
-              </w:rPr>
-              <w:t>}}</w:t>
+            <w:shd w:val="clear" w:color="auto" w:fill="auto"/>
+            <w:vAlign w:val="center"/>
+          </w:tcPr>
+          <w:p>
+            <w:pPr>
+              <w:snapToGrid w:val="0"/>
+              <w:rPr>
+                <w:rFonts w:ascii="Arial" w:hAnsi="Arial" w:cs="Arial"/>
+                <w:sz w:val="20"/>
+                <w:szCs w:val="20"/>
+              </w:rPr>
+            </w:pPr>
+            <w:r>
+              <w:rPr>
+                <w:rFonts w:ascii="Arial" w:hAnsi="Arial" w:cs="Arial"/>
+                <w:sz w:val="20"/>
+                <w:szCs w:val="20"/>
+              </w:rPr>
+              <w:t xml:space="preserve">{{evidencias_ejecucion}}</w:t>
             </w:r>
           </w:p>
         </w:tc>
@@ -1793,6 +1475,7 @@
               <w:bottom w:val="single" w:sz="4" w:space="0" w:color="000000"/>
               <w:right w:val="single" w:sz="4" w:space="0" w:color="000000"/>
             </w:tcBorders>
+            <w:shd w:val="clear" w:color="auto" w:fill="auto"/>
             <w:vAlign w:val="bottom"/>
           </w:tcPr>
           <w:p>
@@ -1814,29 +1497,7 @@
                 <w:sz w:val="20"/>
                 <w:szCs w:val="20"/>
               </w:rPr>
-              <w:t>$ {{</w:t>
-            </w:r>
-            <w:proofErr w:type="spellStart"/>
-            <w:r>
-              <w:rPr>
-                <w:rFonts w:ascii="Arial" w:hAnsi="Arial" w:cs="Arial"/>
-                <w:b/>
-                <w:bCs/>
-                <w:sz w:val="20"/>
-                <w:szCs w:val="20"/>
-              </w:rPr>
-              <w:t>valor_total</w:t>
-            </w:r>
-            <w:proofErr w:type="spellEnd"/>
-            <w:r>
-              <w:rPr>
-                <w:rFonts w:ascii="Arial" w:hAnsi="Arial" w:cs="Arial"/>
-                <w:b/>
-                <w:bCs/>
-                <w:sz w:val="20"/>
-                <w:szCs w:val="20"/>
-              </w:rPr>
-              <w:t>}}</w:t>
+              <w:t xml:space="preserve">$ {{valor_total}}</w:t>
             </w:r>
           </w:p>
         </w:tc>
@@ -1888,6 +1549,7 @@
               <w:bottom w:val="single" w:sz="4" w:space="0" w:color="000000"/>
               <w:right w:val="single" w:sz="4" w:space="0" w:color="000000"/>
             </w:tcBorders>
+            <w:shd w:val="clear" w:color="auto" w:fill="auto"/>
             <w:vAlign w:val="bottom"/>
           </w:tcPr>
           <w:p>
@@ -1907,7 +1569,7 @@
                 <w:sz w:val="20"/>
                 <w:szCs w:val="20"/>
               </w:rPr>
-              <w:t>{{anticipo}}</w:t>
+              <w:t xml:space="preserve">{{anticipo}}</w:t>
             </w:r>
           </w:p>
         </w:tc>
@@ -1961,6 +1623,7 @@
               <w:bottom w:val="single" w:sz="4" w:space="0" w:color="000000"/>
               <w:right w:val="single" w:sz="4" w:space="0" w:color="000000"/>
             </w:tcBorders>
+            <w:shd w:val="clear" w:color="auto" w:fill="auto"/>
             <w:vAlign w:val="bottom"/>
           </w:tcPr>
           <w:p>
@@ -1982,7 +1645,7 @@
                 <w:sz w:val="20"/>
                 <w:szCs w:val="20"/>
               </w:rPr>
-              <w:t>$ {{valor_acta_1}}</w:t>
+              <w:t xml:space="preserve">$ {{valor_acta_1}}</w:t>
             </w:r>
           </w:p>
         </w:tc>
@@ -2035,6 +1698,7 @@
               <w:bottom w:val="single" w:sz="4" w:space="0" w:color="000000"/>
               <w:right w:val="single" w:sz="4" w:space="0" w:color="000000"/>
             </w:tcBorders>
+            <w:shd w:val="clear" w:color="auto" w:fill="auto"/>
             <w:vAlign w:val="bottom"/>
           </w:tcPr>
           <w:p>
@@ -2054,7 +1718,7 @@
                 <w:sz w:val="20"/>
                 <w:szCs w:val="20"/>
               </w:rPr>
-              <w:t>$ {{valor_acta_2}}</w:t>
+              <w:t xml:space="preserve">$ {{valor_acta_2}}</w:t>
             </w:r>
           </w:p>
         </w:tc>
@@ -2107,6 +1771,7 @@
               <w:bottom w:val="single" w:sz="4" w:space="0" w:color="000000"/>
               <w:right w:val="single" w:sz="4" w:space="0" w:color="000000"/>
             </w:tcBorders>
+            <w:shd w:val="clear" w:color="auto" w:fill="auto"/>
             <w:vAlign w:val="bottom"/>
           </w:tcPr>
           <w:p>
@@ -2124,7 +1789,7 @@
                 <w:sz w:val="20"/>
                 <w:szCs w:val="20"/>
               </w:rPr>
-              <w:t>$ {{valor_acta_3}}</w:t>
+              <w:t xml:space="preserve">$ {{valor_acta_3}}</w:t>
             </w:r>
           </w:p>
         </w:tc>
@@ -2163,20 +1828,8 @@
                 <w:sz w:val="20"/>
                 <w:szCs w:val="20"/>
               </w:rPr>
-              <w:t xml:space="preserve">Valor Acta </w:t>
-            </w:r>
-            <w:proofErr w:type="gramStart"/>
-            <w:r>
-              <w:rPr>
-                <w:rFonts w:ascii="Arial" w:hAnsi="Arial" w:cs="Arial"/>
-                <w:b/>
-                <w:bCs/>
-                <w:sz w:val="20"/>
-                <w:szCs w:val="20"/>
-              </w:rPr>
-              <w:t>No….</w:t>
-            </w:r>
-            <w:proofErr w:type="gramEnd"/>
+              <w:t xml:space="preserve">Valor Acta No….</w:t>
+            </w:r>
           </w:p>
         </w:tc>
         <w:tc>
@@ -2189,6 +1842,7 @@
               <w:bottom w:val="single" w:sz="4" w:space="0" w:color="000000"/>
               <w:right w:val="single" w:sz="4" w:space="0" w:color="000000"/>
             </w:tcBorders>
+            <w:shd w:val="clear" w:color="auto" w:fill="auto"/>
             <w:vAlign w:val="bottom"/>
           </w:tcPr>
           <w:p>
@@ -2206,25 +1860,7 @@
                 <w:sz w:val="20"/>
                 <w:szCs w:val="20"/>
               </w:rPr>
-              <w:t>{{</w:t>
-            </w:r>
-            <w:proofErr w:type="spellStart"/>
-            <w:r>
-              <w:rPr>
-                <w:rFonts w:ascii="Arial" w:hAnsi="Arial" w:cs="Arial"/>
-                <w:sz w:val="20"/>
-                <w:szCs w:val="20"/>
-              </w:rPr>
-              <w:t>valor_acta_n</w:t>
-            </w:r>
-            <w:proofErr w:type="spellEnd"/>
-            <w:r>
-              <w:rPr>
-                <w:rFonts w:ascii="Arial" w:hAnsi="Arial" w:cs="Arial"/>
-                <w:sz w:val="20"/>
-                <w:szCs w:val="20"/>
-              </w:rPr>
-              <w:t>}}</w:t>
+              <w:t xml:space="preserve">{{valor_acta_n}}</w:t>
             </w:r>
           </w:p>
         </w:tc>
@@ -2263,29 +1899,7 @@
                 <w:sz w:val="20"/>
                 <w:szCs w:val="20"/>
               </w:rPr>
-              <w:t>Valor a pagar en la presente Acta No.  {{</w:t>
-            </w:r>
-            <w:proofErr w:type="spellStart"/>
-            <w:r>
-              <w:rPr>
-                <w:rFonts w:ascii="Arial" w:hAnsi="Arial" w:cs="Arial"/>
-                <w:b/>
-                <w:bCs/>
-                <w:sz w:val="20"/>
-                <w:szCs w:val="20"/>
-              </w:rPr>
-              <w:t>numero_acta_parcial</w:t>
-            </w:r>
-            <w:proofErr w:type="spellEnd"/>
-            <w:r>
-              <w:rPr>
-                <w:rFonts w:ascii="Arial" w:hAnsi="Arial" w:cs="Arial"/>
-                <w:b/>
-                <w:bCs/>
-                <w:sz w:val="20"/>
-                <w:szCs w:val="20"/>
-              </w:rPr>
-              <w:t>}}</w:t>
+              <w:t xml:space="preserve">Valor a pagar en la presente Acta No.  {{numero_acta_parcial}}</w:t>
             </w:r>
           </w:p>
         </w:tc>
@@ -2299,6 +1913,7 @@
               <w:bottom w:val="single" w:sz="4" w:space="0" w:color="000000"/>
               <w:right w:val="single" w:sz="4" w:space="0" w:color="000000"/>
             </w:tcBorders>
+            <w:shd w:val="clear" w:color="auto" w:fill="auto"/>
             <w:vAlign w:val="bottom"/>
           </w:tcPr>
           <w:p>
@@ -2318,27 +1933,7 @@
                 <w:sz w:val="20"/>
                 <w:szCs w:val="20"/>
               </w:rPr>
-              <w:t>$ {{</w:t>
-            </w:r>
-            <w:proofErr w:type="spellStart"/>
-            <w:r>
-              <w:rPr>
-                <w:rFonts w:ascii="Arial" w:hAnsi="Arial" w:cs="Arial"/>
-                <w:b/>
-                <w:sz w:val="20"/>
-                <w:szCs w:val="20"/>
-              </w:rPr>
-              <w:t>valor_a_pagar_acta_actual</w:t>
-            </w:r>
-            <w:proofErr w:type="spellEnd"/>
-            <w:r>
-              <w:rPr>
-                <w:rFonts w:ascii="Arial" w:hAnsi="Arial" w:cs="Arial"/>
-                <w:b/>
-                <w:sz w:val="20"/>
-                <w:szCs w:val="20"/>
-              </w:rPr>
-              <w:t>}}</w:t>
+              <w:t xml:space="preserve">$ {{valor_a_pagar_acta_actual}}</w:t>
             </w:r>
           </w:p>
         </w:tc>
@@ -2391,6 +1986,7 @@
               <w:bottom w:val="single" w:sz="4" w:space="0" w:color="000000"/>
               <w:right w:val="single" w:sz="4" w:space="0" w:color="000000"/>
             </w:tcBorders>
+            <w:shd w:val="clear" w:color="auto" w:fill="auto"/>
             <w:vAlign w:val="bottom"/>
           </w:tcPr>
           <w:p>
@@ -2411,27 +2007,7 @@
                 <w:sz w:val="20"/>
                 <w:szCs w:val="20"/>
               </w:rPr>
-              <w:t>{{</w:t>
-            </w:r>
-            <w:proofErr w:type="spellStart"/>
-            <w:r>
-              <w:rPr>
-                <w:rFonts w:ascii="Arial" w:hAnsi="Arial" w:cs="Arial"/>
-                <w:b/>
-                <w:sz w:val="20"/>
-                <w:szCs w:val="20"/>
-              </w:rPr>
-              <w:t>saldo_pendiente</w:t>
-            </w:r>
-            <w:proofErr w:type="spellEnd"/>
-            <w:r>
-              <w:rPr>
-                <w:rFonts w:ascii="Arial" w:hAnsi="Arial" w:cs="Arial"/>
-                <w:b/>
-                <w:sz w:val="20"/>
-                <w:szCs w:val="20"/>
-              </w:rPr>
-              <w:t>}}</w:t>
+              <w:t xml:space="preserve">{{saldo_pendiente}}</w:t>
             </w:r>
           </w:p>
           <w:p>
@@ -2523,51 +2099,7 @@
                 <w:sz w:val="20"/>
                 <w:szCs w:val="20"/>
               </w:rPr>
-              <w:t>Declaro bajo la gravedad del juramento que SI ({{</w:t>
-            </w:r>
-            <w:proofErr w:type="spellStart"/>
-            <w:r>
-              <w:rPr>
-                <w:rFonts w:ascii="Arial" w:hAnsi="Arial" w:cs="Arial"/>
-                <w:b/>
-                <w:bCs/>
-                <w:sz w:val="20"/>
-                <w:szCs w:val="20"/>
-              </w:rPr>
-              <w:t>otros_contratos_si</w:t>
-            </w:r>
-            <w:proofErr w:type="spellEnd"/>
-            <w:r>
-              <w:rPr>
-                <w:rFonts w:ascii="Arial" w:hAnsi="Arial" w:cs="Arial"/>
-                <w:b/>
-                <w:bCs/>
-                <w:sz w:val="20"/>
-                <w:szCs w:val="20"/>
-              </w:rPr>
-              <w:t>}}) NO ({{</w:t>
-            </w:r>
-            <w:proofErr w:type="spellStart"/>
-            <w:r>
-              <w:rPr>
-                <w:rFonts w:ascii="Arial" w:hAnsi="Arial" w:cs="Arial"/>
-                <w:b/>
-                <w:bCs/>
-                <w:sz w:val="20"/>
-                <w:szCs w:val="20"/>
-              </w:rPr>
-              <w:t>otros_contratos_no</w:t>
-            </w:r>
-            <w:proofErr w:type="spellEnd"/>
-            <w:r>
-              <w:rPr>
-                <w:rFonts w:ascii="Arial" w:hAnsi="Arial" w:cs="Arial"/>
-                <w:b/>
-                <w:bCs/>
-                <w:sz w:val="20"/>
-                <w:szCs w:val="20"/>
-              </w:rPr>
-              <w:t>}}) poseo otros contratos de prestación de servicios vigentes</w:t>
+              <w:t xml:space="preserve">Declaro bajo la gravedad del juramento que SI ({{otros_contratos_si}}) NO ({{otros_contratos_no}}) poseo otros contratos de prestación de servicios vigentes</w:t>
             </w:r>
           </w:p>
         </w:tc>
@@ -2580,6 +2112,7 @@
               <w:left w:val="single" w:sz="4" w:space="0" w:color="000000"/>
               <w:bottom w:val="single" w:sz="4" w:space="0" w:color="auto"/>
             </w:tcBorders>
+            <w:shd w:val="clear" w:color="auto" w:fill="auto"/>
             <w:vAlign w:val="center"/>
           </w:tcPr>
           <w:p>
@@ -2616,43 +2149,25 @@
               <w:bottom w:val="single" w:sz="4" w:space="0" w:color="auto"/>
               <w:right w:val="single" w:sz="4" w:space="0" w:color="000000"/>
             </w:tcBorders>
-            <w:vAlign w:val="center"/>
-          </w:tcPr>
-          <w:p>
-            <w:pPr>
-              <w:snapToGrid w:val="0"/>
-              <w:jc w:val="center"/>
-              <w:rPr>
-                <w:rFonts w:ascii="Arial" w:hAnsi="Arial" w:cs="Arial"/>
-                <w:sz w:val="20"/>
-                <w:szCs w:val="20"/>
-              </w:rPr>
-            </w:pPr>
-            <w:r>
-              <w:rPr>
-                <w:rFonts w:ascii="Arial" w:hAnsi="Arial" w:cs="Arial"/>
-                <w:sz w:val="20"/>
-                <w:szCs w:val="20"/>
-              </w:rPr>
-              <w:t>$ {{</w:t>
-            </w:r>
-            <w:proofErr w:type="spellStart"/>
-            <w:r>
-              <w:rPr>
-                <w:rFonts w:ascii="Arial" w:hAnsi="Arial" w:cs="Arial"/>
-                <w:sz w:val="20"/>
-                <w:szCs w:val="20"/>
-              </w:rPr>
-              <w:t>valor_ingresos_mensualizados</w:t>
-            </w:r>
-            <w:proofErr w:type="spellEnd"/>
-            <w:r>
-              <w:rPr>
-                <w:rFonts w:ascii="Arial" w:hAnsi="Arial" w:cs="Arial"/>
-                <w:sz w:val="20"/>
-                <w:szCs w:val="20"/>
-              </w:rPr>
-              <w:t>}}</w:t>
+            <w:shd w:val="clear" w:color="auto" w:fill="auto"/>
+            <w:vAlign w:val="center"/>
+          </w:tcPr>
+          <w:p>
+            <w:pPr>
+              <w:snapToGrid w:val="0"/>
+              <w:rPr>
+                <w:rFonts w:ascii="Arial" w:hAnsi="Arial" w:cs="Arial"/>
+                <w:sz w:val="20"/>
+                <w:szCs w:val="20"/>
+              </w:rPr>
+            </w:pPr>
+            <w:r>
+              <w:rPr>
+                <w:rFonts w:ascii="Arial" w:hAnsi="Arial" w:cs="Arial"/>
+                <w:sz w:val="20"/>
+                <w:szCs w:val="20"/>
+              </w:rPr>
+              <w:t xml:space="preserve">$ {{valor_ingresos_mensualizados}}</w:t>
             </w:r>
           </w:p>
         </w:tc>
@@ -2693,7 +2208,7 @@
                 <w:sz w:val="20"/>
                 <w:szCs w:val="20"/>
               </w:rPr>
-              <w:t>VALOR DEL IBC (40% del valor de ingresos mensualizados de los contratos de prestación de servicios vigentes)</w:t>
+              <w:t xml:space="preserve">VALOR DEL IBC (40% del valor de ingresos mensualizados de los contratos de prestación de servicios vigentes)</w:t>
             </w:r>
           </w:p>
         </w:tc>
@@ -2707,43 +2222,25 @@
               <w:bottom w:val="single" w:sz="4" w:space="0" w:color="000000"/>
               <w:right w:val="single" w:sz="4" w:space="0" w:color="000000"/>
             </w:tcBorders>
-            <w:vAlign w:val="center"/>
-          </w:tcPr>
-          <w:p>
-            <w:pPr>
-              <w:snapToGrid w:val="0"/>
-              <w:jc w:val="center"/>
-              <w:rPr>
-                <w:rFonts w:ascii="Arial" w:hAnsi="Arial" w:cs="Arial"/>
-                <w:sz w:val="20"/>
-                <w:szCs w:val="20"/>
-              </w:rPr>
-            </w:pPr>
-            <w:r>
-              <w:rPr>
-                <w:rFonts w:ascii="Arial" w:hAnsi="Arial" w:cs="Arial"/>
-                <w:sz w:val="20"/>
-                <w:szCs w:val="20"/>
-              </w:rPr>
-              <w:t>$ {{</w:t>
-            </w:r>
-            <w:proofErr w:type="spellStart"/>
-            <w:r>
-              <w:rPr>
-                <w:rFonts w:ascii="Arial" w:hAnsi="Arial" w:cs="Arial"/>
-                <w:sz w:val="20"/>
-                <w:szCs w:val="20"/>
-              </w:rPr>
-              <w:t>valor_ibc</w:t>
-            </w:r>
-            <w:proofErr w:type="spellEnd"/>
-            <w:r>
-              <w:rPr>
-                <w:rFonts w:ascii="Arial" w:hAnsi="Arial" w:cs="Arial"/>
-                <w:sz w:val="20"/>
-                <w:szCs w:val="20"/>
-              </w:rPr>
-              <w:t>}}</w:t>
+            <w:shd w:val="clear" w:color="auto" w:fill="auto"/>
+            <w:vAlign w:val="center"/>
+          </w:tcPr>
+          <w:p>
+            <w:pPr>
+              <w:snapToGrid w:val="0"/>
+              <w:rPr>
+                <w:rFonts w:ascii="Arial" w:hAnsi="Arial" w:cs="Arial"/>
+                <w:sz w:val="20"/>
+                <w:szCs w:val="20"/>
+              </w:rPr>
+            </w:pPr>
+            <w:r>
+              <w:rPr>
+                <w:rFonts w:ascii="Arial" w:hAnsi="Arial" w:cs="Arial"/>
+                <w:sz w:val="20"/>
+                <w:szCs w:val="20"/>
+              </w:rPr>
+              <w:t xml:space="preserve">$ {{valor_ibc}}</w:t>
             </w:r>
           </w:p>
         </w:tc>
@@ -2783,7 +2280,6 @@
                 <w:sz w:val="20"/>
                 <w:szCs w:val="20"/>
               </w:rPr>
-              <w:lastRenderedPageBreak/>
               <w:t>Entidad en donde se realiza el pago.</w:t>
             </w:r>
           </w:p>
@@ -2796,6 +2292,7 @@
               <w:left w:val="single" w:sz="4" w:space="0" w:color="000000"/>
               <w:bottom w:val="single" w:sz="4" w:space="0" w:color="000000"/>
             </w:tcBorders>
+            <w:shd w:val="clear" w:color="auto" w:fill="auto"/>
             <w:vAlign w:val="center"/>
           </w:tcPr>
           <w:p>
@@ -2814,25 +2311,7 @@
                 <w:sz w:val="20"/>
                 <w:szCs w:val="20"/>
               </w:rPr>
-              <w:t>{{</w:t>
-            </w:r>
-            <w:proofErr w:type="spellStart"/>
-            <w:r>
-              <w:rPr>
-                <w:rFonts w:ascii="Arial" w:hAnsi="Arial" w:cs="Arial"/>
-                <w:sz w:val="20"/>
-                <w:szCs w:val="20"/>
-              </w:rPr>
-              <w:t>entidad_pago_aportes</w:t>
-            </w:r>
-            <w:proofErr w:type="spellEnd"/>
-            <w:r>
-              <w:rPr>
-                <w:rFonts w:ascii="Arial" w:hAnsi="Arial" w:cs="Arial"/>
-                <w:sz w:val="20"/>
-                <w:szCs w:val="20"/>
-              </w:rPr>
-              <w:t>}}</w:t>
+              <w:t xml:space="preserve">{{entidad_pago_aportes}}</w:t>
             </w:r>
           </w:p>
         </w:tc>
@@ -2845,6 +2324,7 @@
               <w:left w:val="single" w:sz="4" w:space="0" w:color="000000"/>
               <w:bottom w:val="single" w:sz="4" w:space="0" w:color="000000"/>
             </w:tcBorders>
+            <w:shd w:val="clear" w:color="auto" w:fill="auto"/>
             <w:vAlign w:val="center"/>
           </w:tcPr>
           <w:p>
@@ -2881,43 +2361,25 @@
               <w:bottom w:val="single" w:sz="4" w:space="0" w:color="000000"/>
               <w:right w:val="single" w:sz="4" w:space="0" w:color="000000"/>
             </w:tcBorders>
+            <w:shd w:val="clear" w:color="auto" w:fill="auto"/>
             <w:vAlign w:val="bottom"/>
           </w:tcPr>
           <w:p>
             <w:pPr>
               <w:snapToGrid w:val="0"/>
-              <w:jc w:val="center"/>
-              <w:rPr>
-                <w:rFonts w:ascii="Arial" w:hAnsi="Arial" w:cs="Arial"/>
-                <w:sz w:val="20"/>
-                <w:szCs w:val="20"/>
-              </w:rPr>
-            </w:pPr>
-            <w:r>
-              <w:rPr>
-                <w:rFonts w:ascii="Arial" w:hAnsi="Arial" w:cs="Arial"/>
-                <w:sz w:val="20"/>
-                <w:szCs w:val="20"/>
-              </w:rPr>
-              <w:t>$ {{</w:t>
-            </w:r>
-            <w:proofErr w:type="spellStart"/>
-            <w:r>
-              <w:rPr>
-                <w:rFonts w:ascii="Arial" w:hAnsi="Arial" w:cs="Arial"/>
-                <w:sz w:val="20"/>
-                <w:szCs w:val="20"/>
-              </w:rPr>
-              <w:t>valor_total_aporte</w:t>
-            </w:r>
-            <w:proofErr w:type="spellEnd"/>
-            <w:r>
-              <w:rPr>
-                <w:rFonts w:ascii="Arial" w:hAnsi="Arial" w:cs="Arial"/>
-                <w:sz w:val="20"/>
-                <w:szCs w:val="20"/>
-              </w:rPr>
-              <w:t>}}</w:t>
+              <w:rPr>
+                <w:rFonts w:ascii="Arial" w:hAnsi="Arial" w:cs="Arial"/>
+                <w:sz w:val="20"/>
+                <w:szCs w:val="20"/>
+              </w:rPr>
+            </w:pPr>
+            <w:r>
+              <w:rPr>
+                <w:rFonts w:ascii="Arial" w:hAnsi="Arial" w:cs="Arial"/>
+                <w:sz w:val="20"/>
+                <w:szCs w:val="20"/>
+              </w:rPr>
+              <w:t xml:space="preserve">$ {{valor_total_aporte}}</w:t>
             </w:r>
           </w:p>
         </w:tc>
@@ -2958,6 +2420,7 @@
                 <w:sz w:val="20"/>
                 <w:szCs w:val="20"/>
               </w:rPr>
+              <w:lastRenderedPageBreak/>
               <w:t>Recibo No.</w:t>
             </w:r>
           </w:p>
@@ -2970,42 +2433,25 @@
               <w:left w:val="single" w:sz="4" w:space="0" w:color="auto"/>
               <w:bottom w:val="single" w:sz="4" w:space="0" w:color="000000"/>
             </w:tcBorders>
-            <w:vAlign w:val="center"/>
-          </w:tcPr>
-          <w:p>
-            <w:pPr>
-              <w:snapToGrid w:val="0"/>
-              <w:rPr>
-                <w:rFonts w:ascii="Arial" w:hAnsi="Arial" w:cs="Arial"/>
-                <w:sz w:val="20"/>
-                <w:szCs w:val="20"/>
-              </w:rPr>
-            </w:pPr>
-            <w:r>
-              <w:rPr>
-                <w:rFonts w:ascii="Arial" w:hAnsi="Arial" w:cs="Arial"/>
-                <w:sz w:val="20"/>
-                <w:szCs w:val="20"/>
-              </w:rPr>
-              <w:t>{{</w:t>
-            </w:r>
-            <w:proofErr w:type="spellStart"/>
-            <w:r>
-              <w:rPr>
-                <w:rFonts w:ascii="Arial" w:hAnsi="Arial" w:cs="Arial"/>
-                <w:sz w:val="20"/>
-                <w:szCs w:val="20"/>
-              </w:rPr>
-              <w:t>numero_recibo_aportes</w:t>
-            </w:r>
-            <w:proofErr w:type="spellEnd"/>
-            <w:r>
-              <w:rPr>
-                <w:rFonts w:ascii="Arial" w:hAnsi="Arial" w:cs="Arial"/>
-                <w:sz w:val="20"/>
-                <w:szCs w:val="20"/>
-              </w:rPr>
-              <w:t>}}</w:t>
+            <w:shd w:val="clear" w:color="auto" w:fill="auto"/>
+            <w:vAlign w:val="center"/>
+          </w:tcPr>
+          <w:p>
+            <w:pPr>
+              <w:snapToGrid w:val="0"/>
+              <w:rPr>
+                <w:rFonts w:ascii="Arial" w:hAnsi="Arial" w:cs="Arial"/>
+                <w:sz w:val="20"/>
+                <w:szCs w:val="20"/>
+              </w:rPr>
+            </w:pPr>
+            <w:r>
+              <w:rPr>
+                <w:rFonts w:ascii="Arial" w:hAnsi="Arial" w:cs="Arial"/>
+                <w:sz w:val="20"/>
+                <w:szCs w:val="20"/>
+              </w:rPr>
+              <w:t xml:space="preserve">{{numero_recibo_aportes}}</w:t>
             </w:r>
           </w:p>
         </w:tc>
@@ -3018,6 +2464,7 @@
               <w:left w:val="single" w:sz="4" w:space="0" w:color="000000"/>
               <w:bottom w:val="single" w:sz="4" w:space="0" w:color="000000"/>
             </w:tcBorders>
+            <w:shd w:val="clear" w:color="auto" w:fill="auto"/>
             <w:vAlign w:val="center"/>
           </w:tcPr>
           <w:p>
@@ -3053,6 +2500,7 @@
               <w:bottom w:val="single" w:sz="4" w:space="0" w:color="000000"/>
               <w:right w:val="single" w:sz="4" w:space="0" w:color="000000"/>
             </w:tcBorders>
+            <w:shd w:val="clear" w:color="auto" w:fill="auto"/>
             <w:vAlign w:val="bottom"/>
           </w:tcPr>
           <w:p>
@@ -3071,25 +2519,7 @@
                 <w:sz w:val="20"/>
                 <w:szCs w:val="20"/>
               </w:rPr>
-              <w:t>$ {{</w:t>
-            </w:r>
-            <w:proofErr w:type="spellStart"/>
-            <w:r>
-              <w:rPr>
-                <w:rFonts w:ascii="Arial" w:hAnsi="Arial" w:cs="Arial"/>
-                <w:sz w:val="20"/>
-                <w:szCs w:val="20"/>
-              </w:rPr>
-              <w:t>valor_salud</w:t>
-            </w:r>
-            <w:proofErr w:type="spellEnd"/>
-            <w:r>
-              <w:rPr>
-                <w:rFonts w:ascii="Arial" w:hAnsi="Arial" w:cs="Arial"/>
-                <w:sz w:val="20"/>
-                <w:szCs w:val="20"/>
-              </w:rPr>
-              <w:t>}}</w:t>
+              <w:t xml:space="preserve">$ {{valor_salud}}</w:t>
             </w:r>
           </w:p>
         </w:tc>
@@ -3141,50 +2571,29 @@
               <w:left w:val="single" w:sz="4" w:space="0" w:color="000000"/>
               <w:bottom w:val="single" w:sz="4" w:space="0" w:color="000000"/>
             </w:tcBorders>
-            <w:vAlign w:val="center"/>
-          </w:tcPr>
-          <w:p>
-            <w:pPr>
-              <w:snapToGrid w:val="0"/>
-              <w:rPr>
-                <w:rFonts w:ascii="Arial" w:hAnsi="Arial" w:cs="Arial"/>
-                <w:b/>
-                <w:bCs/>
-                <w:sz w:val="20"/>
-                <w:szCs w:val="20"/>
-              </w:rPr>
-            </w:pPr>
-            <w:r>
-              <w:rPr>
-                <w:rFonts w:ascii="Arial" w:hAnsi="Arial" w:cs="Arial"/>
-                <w:b/>
-                <w:bCs/>
-                <w:sz w:val="20"/>
-                <w:szCs w:val="20"/>
-              </w:rPr>
-              <w:t>De: {{</w:t>
-            </w:r>
-            <w:proofErr w:type="spellStart"/>
-            <w:r>
-              <w:rPr>
-                <w:rFonts w:ascii="Arial" w:hAnsi="Arial" w:cs="Arial"/>
-                <w:b/>
-                <w:bCs/>
-                <w:sz w:val="20"/>
-                <w:szCs w:val="20"/>
-              </w:rPr>
-              <w:t>periodo_cotizado_inicio</w:t>
-            </w:r>
-            <w:proofErr w:type="spellEnd"/>
-            <w:r>
-              <w:rPr>
-                <w:rFonts w:ascii="Arial" w:hAnsi="Arial" w:cs="Arial"/>
-                <w:b/>
-                <w:bCs/>
-                <w:sz w:val="20"/>
-                <w:szCs w:val="20"/>
-              </w:rPr>
-              <w:t>}}</w:t>
+            <w:shd w:val="clear" w:color="auto" w:fill="auto"/>
+            <w:vAlign w:val="center"/>
+          </w:tcPr>
+          <w:p>
+            <w:pPr>
+              <w:snapToGrid w:val="0"/>
+              <w:rPr>
+                <w:rFonts w:ascii="Arial" w:hAnsi="Arial" w:cs="Arial"/>
+                <w:b/>
+                <w:bCs/>
+                <w:sz w:val="20"/>
+                <w:szCs w:val="20"/>
+              </w:rPr>
+            </w:pPr>
+            <w:r>
+              <w:rPr>
+                <w:rFonts w:ascii="Arial" w:hAnsi="Arial" w:cs="Arial"/>
+                <w:b/>
+                <w:bCs/>
+                <w:sz w:val="20"/>
+                <w:szCs w:val="20"/>
+              </w:rPr>
+              <w:t xml:space="preserve">De: {{periodo_cotizado_inicio}}</w:t>
             </w:r>
           </w:p>
         </w:tc>
@@ -3197,6 +2606,7 @@
               <w:left w:val="single" w:sz="4" w:space="0" w:color="000000"/>
               <w:bottom w:val="single" w:sz="4" w:space="0" w:color="000000"/>
             </w:tcBorders>
+            <w:shd w:val="clear" w:color="auto" w:fill="auto"/>
             <w:vAlign w:val="center"/>
           </w:tcPr>
           <w:p>
@@ -3232,6 +2642,7 @@
               <w:bottom w:val="single" w:sz="4" w:space="0" w:color="000000"/>
               <w:right w:val="single" w:sz="4" w:space="0" w:color="000000"/>
             </w:tcBorders>
+            <w:shd w:val="clear" w:color="auto" w:fill="auto"/>
             <w:vAlign w:val="bottom"/>
           </w:tcPr>
           <w:p>
@@ -3250,25 +2661,7 @@
                 <w:sz w:val="20"/>
                 <w:szCs w:val="20"/>
               </w:rPr>
-              <w:t>$ {{</w:t>
-            </w:r>
-            <w:proofErr w:type="spellStart"/>
-            <w:r>
-              <w:rPr>
-                <w:rFonts w:ascii="Arial" w:hAnsi="Arial" w:cs="Arial"/>
-                <w:sz w:val="20"/>
-                <w:szCs w:val="20"/>
-              </w:rPr>
-              <w:t>valor_pension</w:t>
-            </w:r>
-            <w:proofErr w:type="spellEnd"/>
-            <w:r>
-              <w:rPr>
-                <w:rFonts w:ascii="Arial" w:hAnsi="Arial" w:cs="Arial"/>
-                <w:sz w:val="20"/>
-                <w:szCs w:val="20"/>
-              </w:rPr>
-              <w:t>}}</w:t>
+              <w:t xml:space="preserve">$ {{valor_pension}}</w:t>
             </w:r>
           </w:p>
         </w:tc>
@@ -3285,6 +2678,7 @@
               <w:left w:val="single" w:sz="4" w:space="0" w:color="000000"/>
               <w:bottom w:val="single" w:sz="4" w:space="0" w:color="000000"/>
             </w:tcBorders>
+            <w:shd w:val="clear" w:color="auto" w:fill="auto"/>
             <w:vAlign w:val="center"/>
           </w:tcPr>
           <w:p>
@@ -3308,50 +2702,29 @@
               <w:left w:val="single" w:sz="4" w:space="0" w:color="000000"/>
               <w:bottom w:val="single" w:sz="4" w:space="0" w:color="000000"/>
             </w:tcBorders>
-            <w:vAlign w:val="center"/>
-          </w:tcPr>
-          <w:p>
-            <w:pPr>
-              <w:snapToGrid w:val="0"/>
-              <w:rPr>
-                <w:rFonts w:ascii="Arial" w:hAnsi="Arial" w:cs="Arial"/>
-                <w:b/>
-                <w:bCs/>
-                <w:sz w:val="20"/>
-                <w:szCs w:val="20"/>
-              </w:rPr>
-            </w:pPr>
-            <w:r>
-              <w:rPr>
-                <w:rFonts w:ascii="Arial" w:hAnsi="Arial" w:cs="Arial"/>
-                <w:b/>
-                <w:bCs/>
-                <w:sz w:val="20"/>
-                <w:szCs w:val="20"/>
-              </w:rPr>
-              <w:t>Hasta: {{</w:t>
-            </w:r>
-            <w:proofErr w:type="spellStart"/>
-            <w:r>
-              <w:rPr>
-                <w:rFonts w:ascii="Arial" w:hAnsi="Arial" w:cs="Arial"/>
-                <w:b/>
-                <w:bCs/>
-                <w:sz w:val="20"/>
-                <w:szCs w:val="20"/>
-              </w:rPr>
-              <w:t>periodo_cotizado_fin</w:t>
-            </w:r>
-            <w:proofErr w:type="spellEnd"/>
-            <w:r>
-              <w:rPr>
-                <w:rFonts w:ascii="Arial" w:hAnsi="Arial" w:cs="Arial"/>
-                <w:b/>
-                <w:bCs/>
-                <w:sz w:val="20"/>
-                <w:szCs w:val="20"/>
-              </w:rPr>
-              <w:t>}}</w:t>
+            <w:shd w:val="clear" w:color="auto" w:fill="auto"/>
+            <w:vAlign w:val="center"/>
+          </w:tcPr>
+          <w:p>
+            <w:pPr>
+              <w:snapToGrid w:val="0"/>
+              <w:rPr>
+                <w:rFonts w:ascii="Arial" w:hAnsi="Arial" w:cs="Arial"/>
+                <w:b/>
+                <w:bCs/>
+                <w:sz w:val="20"/>
+                <w:szCs w:val="20"/>
+              </w:rPr>
+            </w:pPr>
+            <w:r>
+              <w:rPr>
+                <w:rFonts w:ascii="Arial" w:hAnsi="Arial" w:cs="Arial"/>
+                <w:b/>
+                <w:bCs/>
+                <w:sz w:val="20"/>
+                <w:szCs w:val="20"/>
+              </w:rPr>
+              <w:t xml:space="preserve">Hasta: {{periodo_cotizado_fin}}</w:t>
             </w:r>
           </w:p>
         </w:tc>
@@ -3364,6 +2737,7 @@
               <w:left w:val="single" w:sz="4" w:space="0" w:color="000000"/>
               <w:bottom w:val="single" w:sz="4" w:space="0" w:color="000000"/>
             </w:tcBorders>
+            <w:shd w:val="clear" w:color="auto" w:fill="auto"/>
             <w:vAlign w:val="center"/>
           </w:tcPr>
           <w:p>
@@ -3399,6 +2773,7 @@
               <w:bottom w:val="single" w:sz="4" w:space="0" w:color="000000"/>
               <w:right w:val="single" w:sz="4" w:space="0" w:color="000000"/>
             </w:tcBorders>
+            <w:shd w:val="clear" w:color="auto" w:fill="auto"/>
             <w:vAlign w:val="bottom"/>
           </w:tcPr>
           <w:p>
@@ -3417,25 +2792,7 @@
                 <w:sz w:val="20"/>
                 <w:szCs w:val="20"/>
               </w:rPr>
-              <w:t>$ {{</w:t>
-            </w:r>
-            <w:proofErr w:type="spellStart"/>
-            <w:r>
-              <w:rPr>
-                <w:rFonts w:ascii="Arial" w:hAnsi="Arial" w:cs="Arial"/>
-                <w:sz w:val="20"/>
-                <w:szCs w:val="20"/>
-              </w:rPr>
-              <w:t>valor_arl</w:t>
-            </w:r>
-            <w:proofErr w:type="spellEnd"/>
-            <w:r>
-              <w:rPr>
-                <w:rFonts w:ascii="Arial" w:hAnsi="Arial" w:cs="Arial"/>
-                <w:sz w:val="20"/>
-                <w:szCs w:val="20"/>
-              </w:rPr>
-              <w:t>}}</w:t>
+              <w:t xml:space="preserve">$ {{valor_arl}}</w:t>
             </w:r>
           </w:p>
         </w:tc>
@@ -3490,6 +2847,7 @@
               <w:bottom w:val="single" w:sz="4" w:space="0" w:color="000000"/>
               <w:right w:val="single" w:sz="4" w:space="0" w:color="000000"/>
             </w:tcBorders>
+            <w:shd w:val="clear" w:color="auto" w:fill="auto"/>
           </w:tcPr>
           <w:p>
             <w:pPr>
@@ -3567,6 +2925,7 @@
               <w:bottom w:val="single" w:sz="4" w:space="0" w:color="000000"/>
               <w:right w:val="single" w:sz="4" w:space="0" w:color="000000"/>
             </w:tcBorders>
+            <w:shd w:val="clear" w:color="auto" w:fill="auto"/>
           </w:tcPr>
           <w:p>
             <w:pPr>
@@ -3590,10 +2949,62 @@
                 <w:sz w:val="14"/>
                 <w:szCs w:val="14"/>
               </w:rPr>
-              <w:t>{{</w:t>
-            </w:r>
-            <w:proofErr w:type="spellStart"/>
-            <w:r>
+              <w:t xml:space="preserve">{{chk_recibo_pago_ss}}</w:t>
+            </w:r>
+          </w:p>
+        </w:tc>
+      </w:tr>
+      <w:tr>
+        <w:trPr>
+          <w:trHeight w:val="390"/>
+        </w:trPr>
+        <w:tc>
+          <w:tcPr>
+            <w:tcW w:w="7413" w:type="dxa"/>
+            <w:gridSpan w:val="4"/>
+            <w:tcBorders>
+              <w:top w:val="single" w:sz="4" w:space="0" w:color="000000"/>
+              <w:left w:val="single" w:sz="4" w:space="0" w:color="000000"/>
+              <w:bottom w:val="single" w:sz="4" w:space="0" w:color="000000"/>
+            </w:tcBorders>
+            <w:shd w:val="clear" w:color="auto" w:fill="FFFFFF"/>
+            <w:vAlign w:val="center"/>
+          </w:tcPr>
+          <w:p>
+            <w:pPr>
+              <w:snapToGrid w:val="0"/>
+              <w:rPr>
+                <w:rFonts w:ascii="Arial" w:hAnsi="Arial" w:cs="Arial"/>
+                <w:sz w:val="20"/>
+                <w:szCs w:val="20"/>
+              </w:rPr>
+            </w:pPr>
+            <w:r>
+              <w:rPr>
+                <w:rFonts w:ascii="Arial" w:hAnsi="Arial" w:cs="Arial"/>
+                <w:sz w:val="20"/>
+                <w:szCs w:val="20"/>
+              </w:rPr>
+              <w:t xml:space="preserve">Copias planillas de aporte</w:t>
+            </w:r>
+          </w:p>
+        </w:tc>
+        <w:tc>
+          <w:tcPr>
+            <w:tcW w:w="3229" w:type="dxa"/>
+            <w:gridSpan w:val="2"/>
+            <w:tcBorders>
+              <w:top w:val="single" w:sz="4" w:space="0" w:color="000000"/>
+              <w:left w:val="single" w:sz="4" w:space="0" w:color="000000"/>
+              <w:bottom w:val="single" w:sz="4" w:space="0" w:color="000000"/>
+              <w:right w:val="single" w:sz="4" w:space="0" w:color="000000"/>
+            </w:tcBorders>
+            <w:shd w:val="clear" w:color="auto" w:fill="auto"/>
+          </w:tcPr>
+          <w:p>
+            <w:pPr>
+              <w:snapToGrid w:val="0"/>
+              <w:jc w:val="center"/>
               <w:rPr>
                 <w:rFonts w:ascii="Arial" w:hAnsi="Arial" w:cs="Arial"/>
                 <w:i/>
@@ -3602,9 +3013,7 @@
                 <w:sz w:val="14"/>
                 <w:szCs w:val="14"/>
               </w:rPr>
-              <w:t>chk_recibo_pago_ss</w:t>
-            </w:r>
-            <w:proofErr w:type="spellEnd"/>
+            </w:pPr>
             <w:r>
               <w:rPr>
                 <w:rFonts w:ascii="Arial" w:hAnsi="Arial" w:cs="Arial"/>
@@ -3614,104 +3023,7 @@
                 <w:sz w:val="14"/>
                 <w:szCs w:val="14"/>
               </w:rPr>
-              <w:t>}}</w:t>
-            </w:r>
-          </w:p>
-        </w:tc>
-      </w:tr>
-      <w:tr>
-        <w:trPr>
-          <w:trHeight w:val="390"/>
-        </w:trPr>
-        <w:tc>
-          <w:tcPr>
-            <w:tcW w:w="7413" w:type="dxa"/>
-            <w:gridSpan w:val="4"/>
-            <w:tcBorders>
-              <w:top w:val="single" w:sz="4" w:space="0" w:color="000000"/>
-              <w:left w:val="single" w:sz="4" w:space="0" w:color="000000"/>
-              <w:bottom w:val="single" w:sz="4" w:space="0" w:color="000000"/>
-            </w:tcBorders>
-            <w:shd w:val="clear" w:color="auto" w:fill="FFFFFF"/>
-            <w:vAlign w:val="center"/>
-          </w:tcPr>
-          <w:p>
-            <w:pPr>
-              <w:snapToGrid w:val="0"/>
-              <w:rPr>
-                <w:rFonts w:ascii="Arial" w:hAnsi="Arial" w:cs="Arial"/>
-                <w:sz w:val="20"/>
-                <w:szCs w:val="20"/>
-              </w:rPr>
-            </w:pPr>
-            <w:r>
-              <w:rPr>
-                <w:rFonts w:ascii="Arial" w:hAnsi="Arial" w:cs="Arial"/>
-                <w:sz w:val="20"/>
-                <w:szCs w:val="20"/>
-              </w:rPr>
-              <w:t>Copias planillas de aporte</w:t>
-            </w:r>
-          </w:p>
-        </w:tc>
-        <w:tc>
-          <w:tcPr>
-            <w:tcW w:w="3229" w:type="dxa"/>
-            <w:gridSpan w:val="2"/>
-            <w:tcBorders>
-              <w:top w:val="single" w:sz="4" w:space="0" w:color="000000"/>
-              <w:left w:val="single" w:sz="4" w:space="0" w:color="000000"/>
-              <w:bottom w:val="single" w:sz="4" w:space="0" w:color="000000"/>
-              <w:right w:val="single" w:sz="4" w:space="0" w:color="000000"/>
-            </w:tcBorders>
-          </w:tcPr>
-          <w:p>
-            <w:pPr>
-              <w:snapToGrid w:val="0"/>
-              <w:jc w:val="center"/>
-              <w:rPr>
-                <w:rFonts w:ascii="Arial" w:hAnsi="Arial" w:cs="Arial"/>
-                <w:i/>
-                <w:iCs/>
-                <w:color w:val="808080"/>
-                <w:sz w:val="14"/>
-                <w:szCs w:val="14"/>
-              </w:rPr>
-            </w:pPr>
-            <w:r>
-              <w:rPr>
-                <w:rFonts w:ascii="Arial" w:hAnsi="Arial" w:cs="Arial"/>
-                <w:i/>
-                <w:iCs/>
-                <w:color w:val="808080"/>
-                <w:sz w:val="14"/>
-                <w:szCs w:val="14"/>
-              </w:rPr>
-              <w:t>{{</w:t>
-            </w:r>
-            <w:proofErr w:type="spellStart"/>
-            <w:r>
-              <w:rPr>
-                <w:rFonts w:ascii="Arial" w:hAnsi="Arial" w:cs="Arial"/>
-                <w:i/>
-                <w:iCs/>
-                <w:color w:val="808080"/>
-                <w:sz w:val="14"/>
-                <w:szCs w:val="14"/>
-              </w:rPr>
-              <w:t>chk_copias_planillas</w:t>
-            </w:r>
-            <w:proofErr w:type="spellEnd"/>
-            <w:r>
-              <w:rPr>
-                <w:rFonts w:ascii="Arial" w:hAnsi="Arial" w:cs="Arial"/>
-                <w:i/>
-                <w:iCs/>
-                <w:color w:val="808080"/>
-                <w:sz w:val="14"/>
-                <w:szCs w:val="14"/>
-              </w:rPr>
-              <w:t>}}</w:t>
+              <w:t xml:space="preserve">{{chk_copias_planillas}}</w:t>
             </w:r>
           </w:p>
         </w:tc>
@@ -3761,6 +3073,7 @@
               <w:bottom w:val="single" w:sz="4" w:space="0" w:color="000000"/>
               <w:right w:val="single" w:sz="4" w:space="0" w:color="000000"/>
             </w:tcBorders>
+            <w:shd w:val="clear" w:color="auto" w:fill="auto"/>
             <w:vAlign w:val="bottom"/>
           </w:tcPr>
           <w:p>
@@ -3779,25 +3092,7 @@
                 <w:sz w:val="20"/>
                 <w:szCs w:val="20"/>
               </w:rPr>
-              <w:t>{{</w:t>
-            </w:r>
-            <w:proofErr w:type="spellStart"/>
-            <w:r>
-              <w:rPr>
-                <w:rFonts w:ascii="Arial" w:hAnsi="Arial" w:cs="Arial"/>
-                <w:sz w:val="20"/>
-                <w:szCs w:val="20"/>
-              </w:rPr>
-              <w:t>chk_anexos_otros</w:t>
-            </w:r>
-            <w:proofErr w:type="spellEnd"/>
-            <w:r>
-              <w:rPr>
-                <w:rFonts w:ascii="Arial" w:hAnsi="Arial" w:cs="Arial"/>
-                <w:sz w:val="20"/>
-                <w:szCs w:val="20"/>
-              </w:rPr>
-              <w:t>}}</w:t>
+              <w:t xml:space="preserve">{{chk_anexos_otros}}</w:t>
             </w:r>
           </w:p>
         </w:tc>
@@ -3860,6 +3155,7 @@
               <w:left w:val="single" w:sz="4" w:space="0" w:color="000000"/>
               <w:bottom w:val="single" w:sz="4" w:space="0" w:color="000000"/>
             </w:tcBorders>
+            <w:shd w:val="clear" w:color="auto" w:fill="auto"/>
             <w:vAlign w:val="center"/>
           </w:tcPr>
           <w:p>
@@ -3894,6 +3190,7 @@
               <w:left w:val="single" w:sz="4" w:space="0" w:color="000000"/>
               <w:bottom w:val="single" w:sz="4" w:space="0" w:color="000000"/>
             </w:tcBorders>
+            <w:shd w:val="clear" w:color="auto" w:fill="auto"/>
             <w:vAlign w:val="center"/>
           </w:tcPr>
           <w:p>
@@ -3908,6 +3205,16 @@
                 <w:szCs w:val="20"/>
               </w:rPr>
             </w:pPr>
+            <w:r>
+              <w:rPr>
+                <w:rFonts w:ascii="Arial" w:hAnsi="Arial" w:cs="Arial"/>
+                <w:b/>
+                <w:bCs/>
+                <w:sz w:val="20"/>
+                <w:szCs w:val="20"/>
+              </w:rPr>
+              <w:t> </w:t>
+            </w:r>
           </w:p>
         </w:tc>
         <w:tc>
@@ -3920,6 +3227,7 @@
               <w:bottom w:val="single" w:sz="4" w:space="0" w:color="000000"/>
               <w:right w:val="single" w:sz="4" w:space="0" w:color="000000"/>
             </w:tcBorders>
+            <w:shd w:val="clear" w:color="auto" w:fill="auto"/>
             <w:vAlign w:val="center"/>
           </w:tcPr>
           <w:p>
@@ -3932,6 +3240,14 @@
                 <w:szCs w:val="20"/>
               </w:rPr>
             </w:pPr>
+            <w:r>
+              <w:rPr>
+                <w:rFonts w:ascii="Arial" w:hAnsi="Arial" w:cs="Arial"/>
+                <w:sz w:val="20"/>
+                <w:szCs w:val="20"/>
+              </w:rPr>
+              <w:t> </w:t>
+            </w:r>
           </w:p>
         </w:tc>
       </w:tr>
@@ -3946,6 +3262,7 @@
               <w:left w:val="single" w:sz="4" w:space="0" w:color="000000"/>
               <w:bottom w:val="single" w:sz="4" w:space="0" w:color="000000"/>
             </w:tcBorders>
+            <w:shd w:val="clear" w:color="auto" w:fill="auto"/>
             <w:vAlign w:val="center"/>
           </w:tcPr>
           <w:p>
@@ -3980,6 +3297,7 @@
               <w:left w:val="single" w:sz="4" w:space="0" w:color="000000"/>
               <w:bottom w:val="single" w:sz="4" w:space="0" w:color="000000"/>
             </w:tcBorders>
+            <w:shd w:val="clear" w:color="auto" w:fill="auto"/>
             <w:vAlign w:val="center"/>
           </w:tcPr>
           <w:p>
@@ -4002,29 +3320,7 @@
                 <w:sz w:val="20"/>
                 <w:szCs w:val="20"/>
               </w:rPr>
-              <w:t>{{</w:t>
-            </w:r>
-            <w:proofErr w:type="spellStart"/>
-            <w:r>
-              <w:rPr>
-                <w:rFonts w:ascii="Arial" w:hAnsi="Arial" w:cs="Arial"/>
-                <w:b/>
-                <w:bCs/>
-                <w:sz w:val="20"/>
-                <w:szCs w:val="20"/>
-              </w:rPr>
-              <w:t>nombre_contratista</w:t>
-            </w:r>
-            <w:proofErr w:type="spellEnd"/>
-            <w:r>
-              <w:rPr>
-                <w:rFonts w:ascii="Arial" w:hAnsi="Arial" w:cs="Arial"/>
-                <w:b/>
-                <w:bCs/>
-                <w:sz w:val="20"/>
-                <w:szCs w:val="20"/>
-              </w:rPr>
-              <w:t>}}</w:t>
+              <w:t xml:space="preserve">{{nombre_contratista}}</w:t>
             </w:r>
           </w:p>
         </w:tc>
@@ -4038,6 +3334,7 @@
               <w:bottom w:val="single" w:sz="4" w:space="0" w:color="000000"/>
               <w:right w:val="single" w:sz="4" w:space="0" w:color="000000"/>
             </w:tcBorders>
+            <w:shd w:val="clear" w:color="auto" w:fill="auto"/>
             <w:vAlign w:val="center"/>
           </w:tcPr>
           <w:p>
@@ -4060,29 +3357,7 @@
                 <w:sz w:val="20"/>
                 <w:szCs w:val="20"/>
               </w:rPr>
-              <w:t>{{</w:t>
-            </w:r>
-            <w:proofErr w:type="spellStart"/>
-            <w:r>
-              <w:rPr>
-                <w:rFonts w:ascii="Arial" w:hAnsi="Arial" w:cs="Arial"/>
-                <w:b/>
-                <w:bCs/>
-                <w:sz w:val="20"/>
-                <w:szCs w:val="20"/>
-              </w:rPr>
-              <w:t>nombre_supervisor</w:t>
-            </w:r>
-            <w:proofErr w:type="spellEnd"/>
-            <w:r>
-              <w:rPr>
-                <w:rFonts w:ascii="Arial" w:hAnsi="Arial" w:cs="Arial"/>
-                <w:b/>
-                <w:bCs/>
-                <w:sz w:val="20"/>
-                <w:szCs w:val="20"/>
-              </w:rPr>
-              <w:t>}}</w:t>
+              <w:t xml:space="preserve">{{nombre_supervisor}}</w:t>
             </w:r>
           </w:p>
         </w:tc>
@@ -4098,6 +3373,7 @@
               <w:left w:val="single" w:sz="4" w:space="0" w:color="000000"/>
               <w:bottom w:val="single" w:sz="4" w:space="0" w:color="000000"/>
             </w:tcBorders>
+            <w:shd w:val="clear" w:color="auto" w:fill="auto"/>
             <w:vAlign w:val="center"/>
           </w:tcPr>
           <w:p>
@@ -4199,14 +3475,140 @@
         </w:tc>
       </w:tr>
     </w:tbl>
+    <w:p>
+      <w:pPr>
+        <w:jc w:val="center"/>
+        <w:rPr>
+          <w:rFonts w:ascii="Arial" w:hAnsi="Arial" w:cs="Arial"/>
+          <w:b/>
+          <w:lang w:val="es-MX"/>
+        </w:rPr>
+      </w:pPr>
+    </w:p>
+    <w:p>
+      <w:pPr>
+        <w:jc w:val="center"/>
+        <w:rPr>
+          <w:rFonts w:ascii="Arial" w:hAnsi="Arial" w:cs="Arial"/>
+          <w:b/>
+          <w:lang w:val="es-MX"/>
+        </w:rPr>
+      </w:pPr>
+    </w:p>
+    <w:p>
+      <w:pPr>
+        <w:jc w:val="center"/>
+        <w:rPr>
+          <w:rFonts w:ascii="Arial" w:hAnsi="Arial" w:cs="Arial"/>
+          <w:b/>
+          <w:lang w:val="es-MX"/>
+        </w:rPr>
+      </w:pPr>
+    </w:p>
+    <w:p>
+      <w:pPr>
+        <w:jc w:val="center"/>
+        <w:rPr>
+          <w:rFonts w:ascii="Arial" w:hAnsi="Arial" w:cs="Arial"/>
+          <w:b/>
+          <w:lang w:val="es-MX"/>
+        </w:rPr>
+      </w:pPr>
+    </w:p>
+    <w:p>
+      <w:pPr>
+        <w:jc w:val="center"/>
+        <w:rPr>
+          <w:rFonts w:ascii="Arial" w:hAnsi="Arial" w:cs="Arial"/>
+          <w:b/>
+          <w:lang w:val="es-MX"/>
+        </w:rPr>
+      </w:pPr>
+    </w:p>
+    <w:p>
+      <w:pPr>
+        <w:jc w:val="center"/>
+        <w:rPr>
+          <w:rFonts w:ascii="Arial" w:hAnsi="Arial" w:cs="Arial"/>
+          <w:b/>
+          <w:lang w:val="es-MX"/>
+        </w:rPr>
+      </w:pPr>
+    </w:p>
+    <w:p>
+      <w:pPr>
+        <w:jc w:val="center"/>
+        <w:rPr>
+          <w:rFonts w:ascii="Arial" w:hAnsi="Arial" w:cs="Arial"/>
+          <w:b/>
+          <w:lang w:val="es-MX"/>
+        </w:rPr>
+      </w:pPr>
+    </w:p>
+    <w:p>
+      <w:pPr>
+        <w:jc w:val="center"/>
+        <w:rPr>
+          <w:rFonts w:ascii="Arial" w:hAnsi="Arial" w:cs="Arial"/>
+          <w:b/>
+          <w:lang w:val="es-MX"/>
+        </w:rPr>
+      </w:pPr>
+    </w:p>
+    <w:p>
+      <w:pPr>
+        <w:jc w:val="center"/>
+        <w:rPr>
+          <w:rFonts w:ascii="Arial" w:hAnsi="Arial" w:cs="Arial"/>
+          <w:b/>
+          <w:lang w:val="es-MX"/>
+        </w:rPr>
+      </w:pPr>
+    </w:p>
+    <w:p>
+      <w:pPr>
+        <w:jc w:val="center"/>
+        <w:rPr>
+          <w:rFonts w:ascii="Arial" w:hAnsi="Arial" w:cs="Arial"/>
+          <w:b/>
+          <w:lang w:val="es-MX"/>
+        </w:rPr>
+      </w:pPr>
+    </w:p>
+    <w:p>
+      <w:pPr>
+        <w:jc w:val="center"/>
+        <w:rPr>
+          <w:rFonts w:ascii="Arial" w:hAnsi="Arial" w:cs="Arial"/>
+          <w:b/>
+          <w:lang w:val="es-MX"/>
+        </w:rPr>
+      </w:pPr>
+    </w:p>
+    <w:p>
+      <w:pPr>
+        <w:jc w:val="center"/>
+        <w:rPr>
+          <w:rFonts w:ascii="Arial" w:hAnsi="Arial" w:cs="Arial"/>
+          <w:b/>
+          <w:lang w:val="es-MX"/>
+        </w:rPr>
+      </w:pPr>
+    </w:p>
+    <w:p>
+      <w:pPr>
+        <w:jc w:val="center"/>
+        <w:rPr>
+          <w:rFonts w:ascii="Arial" w:hAnsi="Arial" w:cs="Arial"/>
+          <w:b/>
+          <w:lang w:val="es-MX"/>
+        </w:rPr>
+      </w:pPr>
+    </w:p>
     <w:p/>
     <w:sectPr>
-      <w:headerReference w:type="even" r:id="rId7"/>
-      <w:headerReference w:type="default" r:id="rId8"/>
-      <w:footerReference w:type="even" r:id="rId9"/>
-      <w:footerReference w:type="default" r:id="rId10"/>
-      <w:headerReference w:type="first" r:id="rId11"/>
-      <w:footerReference w:type="first" r:id="rId12"/>
+      <w:headerReference w:type="default" r:id="rId7"/>
+      <w:footerReference w:type="default" r:id="rId8"/>
       <w:pgSz w:w="12240" w:h="18720" w:code="14"/>
       <w:pgMar w:top="1134" w:right="1134" w:bottom="1701" w:left="1134" w:header="283" w:footer="567" w:gutter="0"/>
       <w:cols w:space="720"/>
@@ -4217,7 +3619,7 @@
 </file>
 
 <file path=word/endnotes.xml><?xml version="1.0" encoding="utf-8"?>
-<w:endnotes xmlns:wpc="http://schemas.microsoft.com/office/word/2010/wordprocessingCanvas" xmlns:cx="http://schemas.microsoft.com/office/drawing/2014/chartex" xmlns:cx1="http://schemas.microsoft.com/office/drawing/2015/9/8/chartex" xmlns:cx2="http://schemas.microsoft.com/office/drawing/2015/10/21/chartex" xmlns:cx3="http://schemas.microsoft.com/office/drawing/2016/5/9/chartex" xmlns:cx4="http://schemas.microsoft.com/office/drawing/2016/5/10/chartex" xmlns:cx5="http://schemas.microsoft.com/office/drawing/2016/5/11/chartex" xmlns:cx6="http://schemas.microsoft.com/office/drawing/2016/5/12/chartex" xmlns:cx7="http://schemas.microsoft.com/office/drawing/2016/5/13/chartex" xmlns:cx8="http://schemas.microsoft.com/office/drawing/2016/5/14/chartex" xmlns:mc="http://schemas.openxmlformats.org/markup-compatibility/2006" xmlns:aink="http://schemas.microsoft.com/office/drawing/2016/ink" xmlns:am3d="http://schemas.microsoft.com/office/drawing/2017/model3d" xmlns:o="urn:schemas-microsoft-com:office:office" xmlns:oel="http://schemas.microsoft.com/office/2019/extlst" xmlns:r="http://schemas.openxmlformats.org/officeDocument/2006/relationships" xmlns:m="http://schemas.openxmlformats.org/officeDocument/2006/math" xmlns:v="urn:schemas-microsoft-com:vml" xmlns:wp14="http://schemas.microsoft.com/office/word/2010/wordprocessingDrawing" xmlns:wp="http://schemas.openxmlformats.org/drawingml/2006/wordprocessingDrawing" xmlns:w10="urn:schemas-microsoft-com:office:word" xmlns:w="http://schemas.openxmlformats.org/wordprocessingml/2006/main" xmlns:w14="http://schemas.microsoft.com/office/word/2010/wordml" xmlns:w15="http://schemas.microsoft.com/office/word/2012/wordml" xmlns:w16cex="http://schemas.microsoft.com/office/word/2018/wordml/cex" xmlns:w16cid="http://schemas.microsoft.com/office/word/2016/wordml/cid" xmlns:w16="http://schemas.microsoft.com/office/word/2018/wordml" xmlns:w16du="http://schemas.microsoft.com/office/word/2023/wordml/word16du" xmlns:w16sdtdh="http://schemas.microsoft.com/office/word/2020/wordml/sdtdatahash" xmlns:w16sdtfl="http://schemas.microsoft.com/office/word/2024/wordml/sdtformatlock" xmlns:w16se="http://schemas.microsoft.com/office/word/2015/wordml/symex" xmlns:wpg="http://schemas.microsoft.com/office/word/2010/wordprocessingGroup" xmlns:wpi="http://schemas.microsoft.com/office/word/2010/wordprocessingInk" xmlns:wne="http://schemas.microsoft.com/office/word/2006/wordml" xmlns:wps="http://schemas.microsoft.com/office/word/2010/wordprocessingShape" mc:Ignorable="w14 w15 w16se w16cid w16 w16cex w16sdtdh w16sdtfl w16du wp14">
+<w:endnotes xmlns:wpc="http://schemas.microsoft.com/office/word/2010/wordprocessingCanvas" xmlns:cx="http://schemas.microsoft.com/office/drawing/2014/chartex" xmlns:cx1="http://schemas.microsoft.com/office/drawing/2015/9/8/chartex" xmlns:cx2="http://schemas.microsoft.com/office/drawing/2015/10/21/chartex" xmlns:cx3="http://schemas.microsoft.com/office/drawing/2016/5/9/chartex" xmlns:cx4="http://schemas.microsoft.com/office/drawing/2016/5/10/chartex" xmlns:cx5="http://schemas.microsoft.com/office/drawing/2016/5/11/chartex" xmlns:cx6="http://schemas.microsoft.com/office/drawing/2016/5/12/chartex" xmlns:cx7="http://schemas.microsoft.com/office/drawing/2016/5/13/chartex" xmlns:cx8="http://schemas.microsoft.com/office/drawing/2016/5/14/chartex" xmlns:mc="http://schemas.openxmlformats.org/markup-compatibility/2006" xmlns:aink="http://schemas.microsoft.com/office/drawing/2016/ink" xmlns:am3d="http://schemas.microsoft.com/office/drawing/2017/model3d" xmlns:o="urn:schemas-microsoft-com:office:office" xmlns:r="http://schemas.openxmlformats.org/officeDocument/2006/relationships" xmlns:m="http://schemas.openxmlformats.org/officeDocument/2006/math" xmlns:v="urn:schemas-microsoft-com:vml" xmlns:wp14="http://schemas.microsoft.com/office/word/2010/wordprocessingDrawing" xmlns:wp="http://schemas.openxmlformats.org/drawingml/2006/wordprocessingDrawing" xmlns:w10="urn:schemas-microsoft-com:office:word" xmlns:w="http://schemas.openxmlformats.org/wordprocessingml/2006/main" xmlns:w14="http://schemas.microsoft.com/office/word/2010/wordml" xmlns:w15="http://schemas.microsoft.com/office/word/2012/wordml" xmlns:w16cex="http://schemas.microsoft.com/office/word/2018/wordml/cex" xmlns:w16cid="http://schemas.microsoft.com/office/word/2016/wordml/cid" xmlns:w16="http://schemas.microsoft.com/office/word/2018/wordml" xmlns:w16sdtdh="http://schemas.microsoft.com/office/word/2020/wordml/sdtdatahash" xmlns:w16se="http://schemas.microsoft.com/office/word/2015/wordml/symex" xmlns:wpg="http://schemas.microsoft.com/office/word/2010/wordprocessingGroup" xmlns:wpi="http://schemas.microsoft.com/office/word/2010/wordprocessingInk" xmlns:wne="http://schemas.microsoft.com/office/word/2006/wordml" xmlns:wps="http://schemas.microsoft.com/office/word/2010/wordprocessingShape" mc:Ignorable="w14 w15 w16se w16cid w16 w16cex w16sdtdh wp14">
   <w:endnote w:type="separator" w:id="-1">
     <w:p>
       <w:r>
@@ -4236,17 +3638,45 @@
 </file>
 
 <file path=word/footer1.xml><?xml version="1.0" encoding="utf-8"?>
-<w:ftr xmlns:wpc="http://schemas.microsoft.com/office/word/2010/wordprocessingCanvas" xmlns:cx="http://schemas.microsoft.com/office/drawing/2014/chartex" xmlns:cx1="http://schemas.microsoft.com/office/drawing/2015/9/8/chartex" xmlns:cx2="http://schemas.microsoft.com/office/drawing/2015/10/21/chartex" xmlns:cx3="http://schemas.microsoft.com/office/drawing/2016/5/9/chartex" xmlns:cx4="http://schemas.microsoft.com/office/drawing/2016/5/10/chartex" xmlns:cx5="http://schemas.microsoft.com/office/drawing/2016/5/11/chartex" xmlns:cx6="http://schemas.microsoft.com/office/drawing/2016/5/12/chartex" xmlns:cx7="http://schemas.microsoft.com/office/drawing/2016/5/13/chartex" xmlns:cx8="http://schemas.microsoft.com/office/drawing/2016/5/14/chartex" xmlns:mc="http://schemas.openxmlformats.org/markup-compatibility/2006" xmlns:aink="http://schemas.microsoft.com/office/drawing/2016/ink" xmlns:am3d="http://schemas.microsoft.com/office/drawing/2017/model3d" xmlns:o="urn:schemas-microsoft-com:office:office" xmlns:oel="http://schemas.microsoft.com/office/2019/extlst" xmlns:r="http://schemas.openxmlformats.org/officeDocument/2006/relationships" xmlns:m="http://schemas.openxmlformats.org/officeDocument/2006/math" xmlns:v="urn:schemas-microsoft-com:vml" xmlns:wp14="http://schemas.microsoft.com/office/word/2010/wordprocessingDrawing" xmlns:wp="http://schemas.openxmlformats.org/drawingml/2006/wordprocessingDrawing" xmlns:w10="urn:schemas-microsoft-com:office:word" xmlns:w="http://schemas.openxmlformats.org/wordprocessingml/2006/main" xmlns:w14="http://schemas.microsoft.com/office/word/2010/wordml" xmlns:w15="http://schemas.microsoft.com/office/word/2012/wordml" xmlns:w16cex="http://schemas.microsoft.com/office/word/2018/wordml/cex" xmlns:w16cid="http://schemas.microsoft.com/office/word/2016/wordml/cid" xmlns:w16="http://schemas.microsoft.com/office/word/2018/wordml" xmlns:w16du="http://schemas.microsoft.com/office/word/2023/wordml/word16du" xmlns:w16sdtdh="http://schemas.microsoft.com/office/word/2020/wordml/sdtdatahash" xmlns:w16sdtfl="http://schemas.microsoft.com/office/word/2024/wordml/sdtformatlock" xmlns:w16se="http://schemas.microsoft.com/office/word/2015/wordml/symex" xmlns:wpg="http://schemas.microsoft.com/office/word/2010/wordprocessingGroup" xmlns:wpi="http://schemas.microsoft.com/office/word/2010/wordprocessingInk" xmlns:wne="http://schemas.microsoft.com/office/word/2006/wordml" xmlns:wps="http://schemas.microsoft.com/office/word/2010/wordprocessingShape" mc:Ignorable="w14 w15 w16se w16cid w16 w16cex w16sdtdh w16sdtfl w16du wp14">
+<w:ftr xmlns:wpc="http://schemas.microsoft.com/office/word/2010/wordprocessingCanvas" xmlns:cx="http://schemas.microsoft.com/office/drawing/2014/chartex" xmlns:cx1="http://schemas.microsoft.com/office/drawing/2015/9/8/chartex" xmlns:cx2="http://schemas.microsoft.com/office/drawing/2015/10/21/chartex" xmlns:cx3="http://schemas.microsoft.com/office/drawing/2016/5/9/chartex" xmlns:cx4="http://schemas.microsoft.com/office/drawing/2016/5/10/chartex" xmlns:cx5="http://schemas.microsoft.com/office/drawing/2016/5/11/chartex" xmlns:cx6="http://schemas.microsoft.com/office/drawing/2016/5/12/chartex" xmlns:cx7="http://schemas.microsoft.com/office/drawing/2016/5/13/chartex" xmlns:cx8="http://schemas.microsoft.com/office/drawing/2016/5/14/chartex" xmlns:mc="http://schemas.openxmlformats.org/markup-compatibility/2006" xmlns:aink="http://schemas.microsoft.com/office/drawing/2016/ink" xmlns:am3d="http://schemas.microsoft.com/office/drawing/2017/model3d" xmlns:o="urn:schemas-microsoft-com:office:office" xmlns:r="http://schemas.openxmlformats.org/officeDocument/2006/relationships" xmlns:m="http://schemas.openxmlformats.org/officeDocument/2006/math" xmlns:v="urn:schemas-microsoft-com:vml" xmlns:wp14="http://schemas.microsoft.com/office/word/2010/wordprocessingDrawing" xmlns:wp="http://schemas.openxmlformats.org/drawingml/2006/wordprocessingDrawing" xmlns:w10="urn:schemas-microsoft-com:office:word" xmlns:w="http://schemas.openxmlformats.org/wordprocessingml/2006/main" xmlns:w14="http://schemas.microsoft.com/office/word/2010/wordml" xmlns:w15="http://schemas.microsoft.com/office/word/2012/wordml" xmlns:w16cex="http://schemas.microsoft.com/office/word/2018/wordml/cex" xmlns:w16cid="http://schemas.microsoft.com/office/word/2016/wordml/cid" xmlns:w16="http://schemas.microsoft.com/office/word/2018/wordml" xmlns:w16sdtdh="http://schemas.microsoft.com/office/word/2020/wordml/sdtdatahash" xmlns:w16se="http://schemas.microsoft.com/office/word/2015/wordml/symex" xmlns:wpg="http://schemas.microsoft.com/office/word/2010/wordprocessingGroup" xmlns:wpi="http://schemas.microsoft.com/office/word/2010/wordprocessingInk" xmlns:wne="http://schemas.microsoft.com/office/word/2006/wordml" xmlns:wps="http://schemas.microsoft.com/office/word/2010/wordprocessingShape" mc:Ignorable="w14 w15 w16se w16cid w16 w16cex w16sdtdh wp14">
   <w:p>
     <w:pPr>
       <w:pStyle w:val="Piedepgina"/>
+      <w:jc w:val="center"/>
+      <w:rPr>
+        <w:rFonts w:ascii="Arial" w:hAnsi="Arial" w:cs="Arial"/>
+        <w:sz w:val="14"/>
+        <w:szCs w:val="18"/>
+      </w:rPr>
     </w:pPr>
+    <w:r>
+      <w:rPr>
+        <w:rFonts w:ascii="Arial" w:hAnsi="Arial" w:cs="Arial"/>
+        <w:sz w:val="14"/>
+        <w:szCs w:val="18"/>
+      </w:rPr>
+      <w:t>Si este documento se encuentra impreso no se garantiza su vigencia.</w:t>
+    </w:r>
   </w:p>
-</w:ftr>
-</file>
-
-<file path=word/footer2.xml><?xml version="1.0" encoding="utf-8"?>
-<w:ftr xmlns:wpc="http://schemas.microsoft.com/office/word/2010/wordprocessingCanvas" xmlns:cx="http://schemas.microsoft.com/office/drawing/2014/chartex" xmlns:cx1="http://schemas.microsoft.com/office/drawing/2015/9/8/chartex" xmlns:cx2="http://schemas.microsoft.com/office/drawing/2015/10/21/chartex" xmlns:cx3="http://schemas.microsoft.com/office/drawing/2016/5/9/chartex" xmlns:cx4="http://schemas.microsoft.com/office/drawing/2016/5/10/chartex" xmlns:cx5="http://schemas.microsoft.com/office/drawing/2016/5/11/chartex" xmlns:cx6="http://schemas.microsoft.com/office/drawing/2016/5/12/chartex" xmlns:cx7="http://schemas.microsoft.com/office/drawing/2016/5/13/chartex" xmlns:cx8="http://schemas.microsoft.com/office/drawing/2016/5/14/chartex" xmlns:mc="http://schemas.openxmlformats.org/markup-compatibility/2006" xmlns:aink="http://schemas.microsoft.com/office/drawing/2016/ink" xmlns:am3d="http://schemas.microsoft.com/office/drawing/2017/model3d" xmlns:o="urn:schemas-microsoft-com:office:office" xmlns:oel="http://schemas.microsoft.com/office/2019/extlst" xmlns:r="http://schemas.openxmlformats.org/officeDocument/2006/relationships" xmlns:m="http://schemas.openxmlformats.org/officeDocument/2006/math" xmlns:v="urn:schemas-microsoft-com:vml" xmlns:wp14="http://schemas.microsoft.com/office/word/2010/wordprocessingDrawing" xmlns:wp="http://schemas.openxmlformats.org/drawingml/2006/wordprocessingDrawing" xmlns:w10="urn:schemas-microsoft-com:office:word" xmlns:w="http://schemas.openxmlformats.org/wordprocessingml/2006/main" xmlns:w14="http://schemas.microsoft.com/office/word/2010/wordml" xmlns:w15="http://schemas.microsoft.com/office/word/2012/wordml" xmlns:w16cex="http://schemas.microsoft.com/office/word/2018/wordml/cex" xmlns:w16cid="http://schemas.microsoft.com/office/word/2016/wordml/cid" xmlns:w16="http://schemas.microsoft.com/office/word/2018/wordml" xmlns:w16du="http://schemas.microsoft.com/office/word/2023/wordml/word16du" xmlns:w16sdtdh="http://schemas.microsoft.com/office/word/2020/wordml/sdtdatahash" xmlns:w16sdtfl="http://schemas.microsoft.com/office/word/2024/wordml/sdtformatlock" xmlns:w16se="http://schemas.microsoft.com/office/word/2015/wordml/symex" xmlns:wpg="http://schemas.microsoft.com/office/word/2010/wordprocessingGroup" xmlns:wpi="http://schemas.microsoft.com/office/word/2010/wordprocessingInk" xmlns:wne="http://schemas.microsoft.com/office/word/2006/wordml" xmlns:wps="http://schemas.microsoft.com/office/word/2010/wordprocessingShape" mc:Ignorable="w14 w15 w16se w16cid w16 w16cex w16sdtdh w16sdtfl w16du wp14">
+  <w:p>
+    <w:pPr>
+      <w:pStyle w:val="Piedepgina"/>
+      <w:jc w:val="center"/>
+      <w:rPr>
+        <w:rFonts w:ascii="Arial" w:hAnsi="Arial" w:cs="Arial"/>
+        <w:sz w:val="14"/>
+        <w:szCs w:val="18"/>
+      </w:rPr>
+    </w:pPr>
+    <w:r>
+      <w:rPr>
+        <w:rFonts w:ascii="Arial" w:hAnsi="Arial" w:cs="Arial"/>
+        <w:sz w:val="14"/>
+        <w:szCs w:val="18"/>
+      </w:rPr>
+      <w:t>La versión vigente reposa en el Sistema Integrado de Gestión (Intranet)</w:t>
+    </w:r>
+  </w:p>
   <w:p>
     <w:pPr>
       <w:suppressLineNumbers/>
@@ -4312,7 +3742,29 @@
         <w:szCs w:val="16"/>
         <w:lang w:eastAsia="zh-CN"/>
       </w:rPr>
-      <w:t xml:space="preserve">Carrera 15 # 15-28, Armenia Q – CAM Piso 3, C. P. 630004 </w:t>
+      <w:t>Carrera 1</w:t>
+    </w:r>
+    <w:r>
+      <w:rPr>
+        <w:rFonts w:ascii="Arial" w:eastAsia="Arial" w:hAnsi="Arial" w:cs="Arial"/>
+        <w:color w:val="000000"/>
+        <w:kern w:val="1"/>
+        <w:sz w:val="18"/>
+        <w:szCs w:val="16"/>
+        <w:lang w:eastAsia="zh-CN"/>
+      </w:rPr>
+      <w:t>6</w:t>
+    </w:r>
+    <w:r>
+      <w:rPr>
+        <w:rFonts w:ascii="Arial" w:eastAsia="Arial" w:hAnsi="Arial" w:cs="Arial"/>
+        <w:color w:val="000000"/>
+        <w:kern w:val="1"/>
+        <w:sz w:val="18"/>
+        <w:szCs w:val="16"/>
+        <w:lang w:eastAsia="zh-CN"/>
+      </w:rPr>
+      <w:t xml:space="preserve"> # 15-28, Armenia Q – CAM Piso 3, C. P. 630004 </w:t>
     </w:r>
   </w:p>
   <w:p>
@@ -4379,18 +3831,8 @@
 </w:ftr>
 </file>
 
-<file path=word/footer3.xml><?xml version="1.0" encoding="utf-8"?>
-<w:ftr xmlns:wpc="http://schemas.microsoft.com/office/word/2010/wordprocessingCanvas" xmlns:cx="http://schemas.microsoft.com/office/drawing/2014/chartex" xmlns:cx1="http://schemas.microsoft.com/office/drawing/2015/9/8/chartex" xmlns:cx2="http://schemas.microsoft.com/office/drawing/2015/10/21/chartex" xmlns:cx3="http://schemas.microsoft.com/office/drawing/2016/5/9/chartex" xmlns:cx4="http://schemas.microsoft.com/office/drawing/2016/5/10/chartex" xmlns:cx5="http://schemas.microsoft.com/office/drawing/2016/5/11/chartex" xmlns:cx6="http://schemas.microsoft.com/office/drawing/2016/5/12/chartex" xmlns:cx7="http://schemas.microsoft.com/office/drawing/2016/5/13/chartex" xmlns:cx8="http://schemas.microsoft.com/office/drawing/2016/5/14/chartex" xmlns:mc="http://schemas.openxmlformats.org/markup-compatibility/2006" xmlns:aink="http://schemas.microsoft.com/office/drawing/2016/ink" xmlns:am3d="http://schemas.microsoft.com/office/drawing/2017/model3d" xmlns:o="urn:schemas-microsoft-com:office:office" xmlns:oel="http://schemas.microsoft.com/office/2019/extlst" xmlns:r="http://schemas.openxmlformats.org/officeDocument/2006/relationships" xmlns:m="http://schemas.openxmlformats.org/officeDocument/2006/math" xmlns:v="urn:schemas-microsoft-com:vml" xmlns:wp14="http://schemas.microsoft.com/office/word/2010/wordprocessingDrawing" xmlns:wp="http://schemas.openxmlformats.org/drawingml/2006/wordprocessingDrawing" xmlns:w10="urn:schemas-microsoft-com:office:word" xmlns:w="http://schemas.openxmlformats.org/wordprocessingml/2006/main" xmlns:w14="http://schemas.microsoft.com/office/word/2010/wordml" xmlns:w15="http://schemas.microsoft.com/office/word/2012/wordml" xmlns:w16cex="http://schemas.microsoft.com/office/word/2018/wordml/cex" xmlns:w16cid="http://schemas.microsoft.com/office/word/2016/wordml/cid" xmlns:w16="http://schemas.microsoft.com/office/word/2018/wordml" xmlns:w16du="http://schemas.microsoft.com/office/word/2023/wordml/word16du" xmlns:w16sdtdh="http://schemas.microsoft.com/office/word/2020/wordml/sdtdatahash" xmlns:w16sdtfl="http://schemas.microsoft.com/office/word/2024/wordml/sdtformatlock" xmlns:w16se="http://schemas.microsoft.com/office/word/2015/wordml/symex" xmlns:wpg="http://schemas.microsoft.com/office/word/2010/wordprocessingGroup" xmlns:wpi="http://schemas.microsoft.com/office/word/2010/wordprocessingInk" xmlns:wne="http://schemas.microsoft.com/office/word/2006/wordml" xmlns:wps="http://schemas.microsoft.com/office/word/2010/wordprocessingShape" mc:Ignorable="w14 w15 w16se w16cid w16 w16cex w16sdtdh w16sdtfl w16du wp14">
-  <w:p>
-    <w:pPr>
-      <w:pStyle w:val="Piedepgina"/>
-    </w:pPr>
-  </w:p>
-</w:ftr>
-</file>
-
 <file path=word/footnotes.xml><?xml version="1.0" encoding="utf-8"?>
-<w:footnotes xmlns:wpc="http://schemas.microsoft.com/office/word/2010/wordprocessingCanvas" xmlns:cx="http://schemas.microsoft.com/office/drawing/2014/chartex" xmlns:cx1="http://schemas.microsoft.com/office/drawing/2015/9/8/chartex" xmlns:cx2="http://schemas.microsoft.com/office/drawing/2015/10/21/chartex" xmlns:cx3="http://schemas.microsoft.com/office/drawing/2016/5/9/chartex" xmlns:cx4="http://schemas.microsoft.com/office/drawing/2016/5/10/chartex" xmlns:cx5="http://schemas.microsoft.com/office/drawing/2016/5/11/chartex" xmlns:cx6="http://schemas.microsoft.com/office/drawing/2016/5/12/chartex" xmlns:cx7="http://schemas.microsoft.com/office/drawing/2016/5/13/chartex" xmlns:cx8="http://schemas.microsoft.com/office/drawing/2016/5/14/chartex" xmlns:mc="http://schemas.openxmlformats.org/markup-compatibility/2006" xmlns:aink="http://schemas.microsoft.com/office/drawing/2016/ink" xmlns:am3d="http://schemas.microsoft.com/office/drawing/2017/model3d" xmlns:o="urn:schemas-microsoft-com:office:office" xmlns:oel="http://schemas.microsoft.com/office/2019/extlst" xmlns:r="http://schemas.openxmlformats.org/officeDocument/2006/relationships" xmlns:m="http://schemas.openxmlformats.org/officeDocument/2006/math" xmlns:v="urn:schemas-microsoft-com:vml" xmlns:wp14="http://schemas.microsoft.com/office/word/2010/wordprocessingDrawing" xmlns:wp="http://schemas.openxmlformats.org/drawingml/2006/wordprocessingDrawing" xmlns:w10="urn:schemas-microsoft-com:office:word" xmlns:w="http://schemas.openxmlformats.org/wordprocessingml/2006/main" xmlns:w14="http://schemas.microsoft.com/office/word/2010/wordml" xmlns:w15="http://schemas.microsoft.com/office/word/2012/wordml" xmlns:w16cex="http://schemas.microsoft.com/office/word/2018/wordml/cex" xmlns:w16cid="http://schemas.microsoft.com/office/word/2016/wordml/cid" xmlns:w16="http://schemas.microsoft.com/office/word/2018/wordml" xmlns:w16du="http://schemas.microsoft.com/office/word/2023/wordml/word16du" xmlns:w16sdtdh="http://schemas.microsoft.com/office/word/2020/wordml/sdtdatahash" xmlns:w16sdtfl="http://schemas.microsoft.com/office/word/2024/wordml/sdtformatlock" xmlns:w16se="http://schemas.microsoft.com/office/word/2015/wordml/symex" xmlns:wpg="http://schemas.microsoft.com/office/word/2010/wordprocessingGroup" xmlns:wpi="http://schemas.microsoft.com/office/word/2010/wordprocessingInk" xmlns:wne="http://schemas.microsoft.com/office/word/2006/wordml" xmlns:wps="http://schemas.microsoft.com/office/word/2010/wordprocessingShape" mc:Ignorable="w14 w15 w16se w16cid w16 w16cex w16sdtdh w16sdtfl w16du wp14">
+<w:footnotes xmlns:wpc="http://schemas.microsoft.com/office/word/2010/wordprocessingCanvas" xmlns:cx="http://schemas.microsoft.com/office/drawing/2014/chartex" xmlns:cx1="http://schemas.microsoft.com/office/drawing/2015/9/8/chartex" xmlns:cx2="http://schemas.microsoft.com/office/drawing/2015/10/21/chartex" xmlns:cx3="http://schemas.microsoft.com/office/drawing/2016/5/9/chartex" xmlns:cx4="http://schemas.microsoft.com/office/drawing/2016/5/10/chartex" xmlns:cx5="http://schemas.microsoft.com/office/drawing/2016/5/11/chartex" xmlns:cx6="http://schemas.microsoft.com/office/drawing/2016/5/12/chartex" xmlns:cx7="http://schemas.microsoft.com/office/drawing/2016/5/13/chartex" xmlns:cx8="http://schemas.microsoft.com/office/drawing/2016/5/14/chartex" xmlns:mc="http://schemas.openxmlformats.org/markup-compatibility/2006" xmlns:aink="http://schemas.microsoft.com/office/drawing/2016/ink" xmlns:am3d="http://schemas.microsoft.com/office/drawing/2017/model3d" xmlns:o="urn:schemas-microsoft-com:office:office" xmlns:r="http://schemas.openxmlformats.org/officeDocument/2006/relationships" xmlns:m="http://schemas.openxmlformats.org/officeDocument/2006/math" xmlns:v="urn:schemas-microsoft-com:vml" xmlns:wp14="http://schemas.microsoft.com/office/word/2010/wordprocessingDrawing" xmlns:wp="http://schemas.openxmlformats.org/drawingml/2006/wordprocessingDrawing" xmlns:w10="urn:schemas-microsoft-com:office:word" xmlns:w="http://schemas.openxmlformats.org/wordprocessingml/2006/main" xmlns:w14="http://schemas.microsoft.com/office/word/2010/wordml" xmlns:w15="http://schemas.microsoft.com/office/word/2012/wordml" xmlns:w16cex="http://schemas.microsoft.com/office/word/2018/wordml/cex" xmlns:w16cid="http://schemas.microsoft.com/office/word/2016/wordml/cid" xmlns:w16="http://schemas.microsoft.com/office/word/2018/wordml" xmlns:w16sdtdh="http://schemas.microsoft.com/office/word/2020/wordml/sdtdatahash" xmlns:w16se="http://schemas.microsoft.com/office/word/2015/wordml/symex" xmlns:wpg="http://schemas.microsoft.com/office/word/2010/wordprocessingGroup" xmlns:wpi="http://schemas.microsoft.com/office/word/2010/wordprocessingInk" xmlns:wne="http://schemas.microsoft.com/office/word/2006/wordml" xmlns:wps="http://schemas.microsoft.com/office/word/2010/wordprocessingShape" mc:Ignorable="w14 w15 w16se w16cid w16 w16cex w16sdtdh wp14">
   <w:footnote w:type="separator" w:id="-1">
     <w:p>
       <w:r>
@@ -4409,17 +3851,7 @@
 </file>
 
 <file path=word/header1.xml><?xml version="1.0" encoding="utf-8"?>
-<w:hdr xmlns:wpc="http://schemas.microsoft.com/office/word/2010/wordprocessingCanvas" xmlns:cx="http://schemas.microsoft.com/office/drawing/2014/chartex" xmlns:cx1="http://schemas.microsoft.com/office/drawing/2015/9/8/chartex" xmlns:cx2="http://schemas.microsoft.com/office/drawing/2015/10/21/chartex" xmlns:cx3="http://schemas.microsoft.com/office/drawing/2016/5/9/chartex" xmlns:cx4="http://schemas.microsoft.com/office/drawing/2016/5/10/chartex" xmlns:cx5="http://schemas.microsoft.com/office/drawing/2016/5/11/chartex" xmlns:cx6="http://schemas.microsoft.com/office/drawing/2016/5/12/chartex" xmlns:cx7="http://schemas.microsoft.com/office/drawing/2016/5/13/chartex" xmlns:cx8="http://schemas.microsoft.com/office/drawing/2016/5/14/chartex" xmlns:mc="http://schemas.openxmlformats.org/markup-compatibility/2006" xmlns:aink="http://schemas.microsoft.com/office/drawing/2016/ink" xmlns:am3d="http://schemas.microsoft.com/office/drawing/2017/model3d" xmlns:o="urn:schemas-microsoft-com:office:office" xmlns:oel="http://schemas.microsoft.com/office/2019/extlst" xmlns:r="http://schemas.openxmlformats.org/officeDocument/2006/relationships" xmlns:m="http://schemas.openxmlformats.org/officeDocument/2006/math" xmlns:v="urn:schemas-microsoft-com:vml" xmlns:wp14="http://schemas.microsoft.com/office/word/2010/wordprocessingDrawing" xmlns:wp="http://schemas.openxmlformats.org/drawingml/2006/wordprocessingDrawing" xmlns:w10="urn:schemas-microsoft-com:office:word" xmlns:w="http://schemas.openxmlformats.org/wordprocessingml/2006/main" xmlns:w14="http://schemas.microsoft.com/office/word/2010/wordml" xmlns:w15="http://schemas.microsoft.com/office/word/2012/wordml" xmlns:w16cex="http://schemas.microsoft.com/office/word/2018/wordml/cex" xmlns:w16cid="http://schemas.microsoft.com/office/word/2016/wordml/cid" xmlns:w16="http://schemas.microsoft.com/office/word/2018/wordml" xmlns:w16du="http://schemas.microsoft.com/office/word/2023/wordml/word16du" xmlns:w16sdtdh="http://schemas.microsoft.com/office/word/2020/wordml/sdtdatahash" xmlns:w16sdtfl="http://schemas.microsoft.com/office/word/2024/wordml/sdtformatlock" xmlns:w16se="http://schemas.microsoft.com/office/word/2015/wordml/symex" xmlns:wpg="http://schemas.microsoft.com/office/word/2010/wordprocessingGroup" xmlns:wpi="http://schemas.microsoft.com/office/word/2010/wordprocessingInk" xmlns:wne="http://schemas.microsoft.com/office/word/2006/wordml" xmlns:wps="http://schemas.microsoft.com/office/word/2010/wordprocessingShape" mc:Ignorable="w14 w15 w16se w16cid w16 w16cex w16sdtdh w16sdtfl w16du wp14">
-  <w:p>
-    <w:pPr>
-      <w:pStyle w:val="Encabezado"/>
-    </w:pPr>
-  </w:p>
-</w:hdr>
-</file>
-
-<file path=word/header2.xml><?xml version="1.0" encoding="utf-8"?>
-<w:hdr xmlns:wpc="http://schemas.microsoft.com/office/word/2010/wordprocessingCanvas" xmlns:cx="http://schemas.microsoft.com/office/drawing/2014/chartex" xmlns:cx1="http://schemas.microsoft.com/office/drawing/2015/9/8/chartex" xmlns:cx2="http://schemas.microsoft.com/office/drawing/2015/10/21/chartex" xmlns:cx3="http://schemas.microsoft.com/office/drawing/2016/5/9/chartex" xmlns:cx4="http://schemas.microsoft.com/office/drawing/2016/5/10/chartex" xmlns:cx5="http://schemas.microsoft.com/office/drawing/2016/5/11/chartex" xmlns:cx6="http://schemas.microsoft.com/office/drawing/2016/5/12/chartex" xmlns:cx7="http://schemas.microsoft.com/office/drawing/2016/5/13/chartex" xmlns:cx8="http://schemas.microsoft.com/office/drawing/2016/5/14/chartex" xmlns:mc="http://schemas.openxmlformats.org/markup-compatibility/2006" xmlns:aink="http://schemas.microsoft.com/office/drawing/2016/ink" xmlns:am3d="http://schemas.microsoft.com/office/drawing/2017/model3d" xmlns:o="urn:schemas-microsoft-com:office:office" xmlns:oel="http://schemas.microsoft.com/office/2019/extlst" xmlns:r="http://schemas.openxmlformats.org/officeDocument/2006/relationships" xmlns:m="http://schemas.openxmlformats.org/officeDocument/2006/math" xmlns:v="urn:schemas-microsoft-com:vml" xmlns:wp14="http://schemas.microsoft.com/office/word/2010/wordprocessingDrawing" xmlns:wp="http://schemas.openxmlformats.org/drawingml/2006/wordprocessingDrawing" xmlns:w10="urn:schemas-microsoft-com:office:word" xmlns:w="http://schemas.openxmlformats.org/wordprocessingml/2006/main" xmlns:w14="http://schemas.microsoft.com/office/word/2010/wordml" xmlns:w15="http://schemas.microsoft.com/office/word/2012/wordml" xmlns:w16cex="http://schemas.microsoft.com/office/word/2018/wordml/cex" xmlns:w16cid="http://schemas.microsoft.com/office/word/2016/wordml/cid" xmlns:w16="http://schemas.microsoft.com/office/word/2018/wordml" xmlns:w16du="http://schemas.microsoft.com/office/word/2023/wordml/word16du" xmlns:w16sdtdh="http://schemas.microsoft.com/office/word/2020/wordml/sdtdatahash" xmlns:w16sdtfl="http://schemas.microsoft.com/office/word/2024/wordml/sdtformatlock" xmlns:w16se="http://schemas.microsoft.com/office/word/2015/wordml/symex" xmlns:wpg="http://schemas.microsoft.com/office/word/2010/wordprocessingGroup" xmlns:wpi="http://schemas.microsoft.com/office/word/2010/wordprocessingInk" xmlns:wne="http://schemas.microsoft.com/office/word/2006/wordml" xmlns:wps="http://schemas.microsoft.com/office/word/2010/wordprocessingShape" mc:Ignorable="w14 w15 w16se w16cid w16 w16cex w16sdtdh w16sdtfl w16du wp14">
+<w:hdr xmlns:wpc="http://schemas.microsoft.com/office/word/2010/wordprocessingCanvas" xmlns:cx="http://schemas.microsoft.com/office/drawing/2014/chartex" xmlns:cx1="http://schemas.microsoft.com/office/drawing/2015/9/8/chartex" xmlns:cx2="http://schemas.microsoft.com/office/drawing/2015/10/21/chartex" xmlns:cx3="http://schemas.microsoft.com/office/drawing/2016/5/9/chartex" xmlns:cx4="http://schemas.microsoft.com/office/drawing/2016/5/10/chartex" xmlns:cx5="http://schemas.microsoft.com/office/drawing/2016/5/11/chartex" xmlns:cx6="http://schemas.microsoft.com/office/drawing/2016/5/12/chartex" xmlns:cx7="http://schemas.microsoft.com/office/drawing/2016/5/13/chartex" xmlns:cx8="http://schemas.microsoft.com/office/drawing/2016/5/14/chartex" xmlns:mc="http://schemas.openxmlformats.org/markup-compatibility/2006" xmlns:aink="http://schemas.microsoft.com/office/drawing/2016/ink" xmlns:am3d="http://schemas.microsoft.com/office/drawing/2017/model3d" xmlns:o="urn:schemas-microsoft-com:office:office" xmlns:r="http://schemas.openxmlformats.org/officeDocument/2006/relationships" xmlns:m="http://schemas.openxmlformats.org/officeDocument/2006/math" xmlns:v="urn:schemas-microsoft-com:vml" xmlns:wp14="http://schemas.microsoft.com/office/word/2010/wordprocessingDrawing" xmlns:wp="http://schemas.openxmlformats.org/drawingml/2006/wordprocessingDrawing" xmlns:w10="urn:schemas-microsoft-com:office:word" xmlns:w="http://schemas.openxmlformats.org/wordprocessingml/2006/main" xmlns:w14="http://schemas.microsoft.com/office/word/2010/wordml" xmlns:w15="http://schemas.microsoft.com/office/word/2012/wordml" xmlns:w16cex="http://schemas.microsoft.com/office/word/2018/wordml/cex" xmlns:w16cid="http://schemas.microsoft.com/office/word/2016/wordml/cid" xmlns:w16="http://schemas.microsoft.com/office/word/2018/wordml" xmlns:w16sdtdh="http://schemas.microsoft.com/office/word/2020/wordml/sdtdatahash" xmlns:w16se="http://schemas.microsoft.com/office/word/2015/wordml/symex" xmlns:wpg="http://schemas.microsoft.com/office/word/2010/wordprocessingGroup" xmlns:wpi="http://schemas.microsoft.com/office/word/2010/wordprocessingInk" xmlns:wne="http://schemas.microsoft.com/office/word/2006/wordml" xmlns:wps="http://schemas.microsoft.com/office/word/2010/wordprocessingShape" mc:Ignorable="w14 w15 w16se w16cid w16 w16cex w16sdtdh wp14">
   <w:tbl>
     <w:tblPr>
       <w:tblW w:w="10675" w:type="dxa"/>
@@ -4446,6 +3878,7 @@
             <w:left w:val="single" w:sz="4" w:space="0" w:color="000000"/>
             <w:bottom w:val="single" w:sz="4" w:space="0" w:color="000000"/>
           </w:tcBorders>
+          <w:shd w:val="clear" w:color="auto" w:fill="auto"/>
           <w:vAlign w:val="center"/>
         </w:tcPr>
         <w:p>
@@ -4466,7 +3899,7 @@
               <w:lang w:val="es-ES_tradnl"/>
             </w:rPr>
             <w:drawing>
-              <wp:inline distT="0" distB="0" distL="0" distR="0" wp14:anchorId="56059275" wp14:editId="2ED0745D">
+              <wp:inline distT="0" distB="0" distL="0" distR="0" wp14:anchorId="4FFFDBBB" wp14:editId="698B3118">
                 <wp:extent cx="601980" cy="685800"/>
                 <wp:effectExtent l="0" t="0" r="0" b="0"/>
                 <wp:docPr id="68" name="Imagen 68"/>
@@ -4527,6 +3960,7 @@
             <w:left w:val="single" w:sz="4" w:space="0" w:color="000000"/>
             <w:bottom w:val="single" w:sz="4" w:space="0" w:color="000000"/>
           </w:tcBorders>
+          <w:shd w:val="clear" w:color="auto" w:fill="auto"/>
           <w:vAlign w:val="center"/>
         </w:tcPr>
         <w:p>
@@ -4687,6 +4121,7 @@
             <w:bottom w:val="single" w:sz="4" w:space="0" w:color="000000"/>
             <w:right w:val="single" w:sz="4" w:space="0" w:color="000000"/>
           </w:tcBorders>
+          <w:shd w:val="clear" w:color="auto" w:fill="auto"/>
           <w:vAlign w:val="center"/>
         </w:tcPr>
         <w:p>
@@ -4732,6 +4167,7 @@
             <w:left w:val="single" w:sz="4" w:space="0" w:color="000000"/>
             <w:bottom w:val="single" w:sz="4" w:space="0" w:color="000000"/>
           </w:tcBorders>
+          <w:shd w:val="clear" w:color="auto" w:fill="auto"/>
           <w:vAlign w:val="center"/>
         </w:tcPr>
         <w:p>
@@ -4752,6 +4188,7 @@
             <w:left w:val="single" w:sz="4" w:space="0" w:color="000000"/>
             <w:bottom w:val="single" w:sz="4" w:space="0" w:color="000000"/>
           </w:tcBorders>
+          <w:shd w:val="clear" w:color="auto" w:fill="auto"/>
           <w:vAlign w:val="center"/>
         </w:tcPr>
         <w:p>
@@ -4771,6 +4208,7 @@
             <w:bottom w:val="single" w:sz="4" w:space="0" w:color="000000"/>
             <w:right w:val="single" w:sz="4" w:space="0" w:color="000000"/>
           </w:tcBorders>
+          <w:shd w:val="clear" w:color="auto" w:fill="auto"/>
           <w:vAlign w:val="center"/>
         </w:tcPr>
         <w:p>
@@ -4797,7 +4235,7 @@
               <w:sz w:val="20"/>
               <w:szCs w:val="20"/>
             </w:rPr>
-            <w:t>24/02/2025</w:t>
+            <w:t>28/09/2026</w:t>
           </w:r>
         </w:p>
       </w:tc>
@@ -4816,6 +4254,7 @@
             <w:left w:val="single" w:sz="4" w:space="0" w:color="000000"/>
             <w:bottom w:val="single" w:sz="4" w:space="0" w:color="000000"/>
           </w:tcBorders>
+          <w:shd w:val="clear" w:color="auto" w:fill="auto"/>
           <w:vAlign w:val="center"/>
         </w:tcPr>
         <w:p>
@@ -4836,6 +4275,7 @@
             <w:left w:val="single" w:sz="4" w:space="0" w:color="000000"/>
             <w:bottom w:val="single" w:sz="4" w:space="0" w:color="000000"/>
           </w:tcBorders>
+          <w:shd w:val="clear" w:color="auto" w:fill="auto"/>
           <w:vAlign w:val="center"/>
         </w:tcPr>
         <w:p>
@@ -4855,6 +4295,7 @@
             <w:bottom w:val="single" w:sz="4" w:space="0" w:color="000000"/>
             <w:right w:val="single" w:sz="4" w:space="0" w:color="000000"/>
           </w:tcBorders>
+          <w:shd w:val="clear" w:color="auto" w:fill="auto"/>
           <w:vAlign w:val="center"/>
         </w:tcPr>
         <w:p>
@@ -4881,7 +4322,15 @@
               <w:sz w:val="20"/>
               <w:szCs w:val="20"/>
             </w:rPr>
-            <w:t>005</w:t>
+            <w:t>00</w:t>
+          </w:r>
+          <w:r>
+            <w:rPr>
+              <w:rFonts w:ascii="Arial" w:hAnsi="Arial" w:cs="Arial"/>
+              <w:sz w:val="20"/>
+              <w:szCs w:val="20"/>
+            </w:rPr>
+            <w:t>6</w:t>
           </w:r>
         </w:p>
       </w:tc>
@@ -4900,6 +4349,7 @@
             <w:left w:val="single" w:sz="4" w:space="0" w:color="000000"/>
             <w:bottom w:val="single" w:sz="4" w:space="0" w:color="000000"/>
           </w:tcBorders>
+          <w:shd w:val="clear" w:color="auto" w:fill="auto"/>
           <w:vAlign w:val="center"/>
         </w:tcPr>
         <w:p>
@@ -4920,6 +4370,7 @@
             <w:left w:val="single" w:sz="4" w:space="0" w:color="000000"/>
             <w:bottom w:val="single" w:sz="4" w:space="0" w:color="000000"/>
           </w:tcBorders>
+          <w:shd w:val="clear" w:color="auto" w:fill="auto"/>
           <w:vAlign w:val="center"/>
         </w:tcPr>
         <w:p>
@@ -4939,6 +4390,7 @@
             <w:bottom w:val="single" w:sz="4" w:space="0" w:color="000000"/>
             <w:right w:val="single" w:sz="4" w:space="0" w:color="000000"/>
           </w:tcBorders>
+          <w:shd w:val="clear" w:color="auto" w:fill="auto"/>
           <w:vAlign w:val="center"/>
         </w:tcPr>
         <w:p>
@@ -5059,18 +4511,8 @@
 </w:hdr>
 </file>
 
-<file path=word/header3.xml><?xml version="1.0" encoding="utf-8"?>
-<w:hdr xmlns:wpc="http://schemas.microsoft.com/office/word/2010/wordprocessingCanvas" xmlns:cx="http://schemas.microsoft.com/office/drawing/2014/chartex" xmlns:cx1="http://schemas.microsoft.com/office/drawing/2015/9/8/chartex" xmlns:cx2="http://schemas.microsoft.com/office/drawing/2015/10/21/chartex" xmlns:cx3="http://schemas.microsoft.com/office/drawing/2016/5/9/chartex" xmlns:cx4="http://schemas.microsoft.com/office/drawing/2016/5/10/chartex" xmlns:cx5="http://schemas.microsoft.com/office/drawing/2016/5/11/chartex" xmlns:cx6="http://schemas.microsoft.com/office/drawing/2016/5/12/chartex" xmlns:cx7="http://schemas.microsoft.com/office/drawing/2016/5/13/chartex" xmlns:cx8="http://schemas.microsoft.com/office/drawing/2016/5/14/chartex" xmlns:mc="http://schemas.openxmlformats.org/markup-compatibility/2006" xmlns:aink="http://schemas.microsoft.com/office/drawing/2016/ink" xmlns:am3d="http://schemas.microsoft.com/office/drawing/2017/model3d" xmlns:o="urn:schemas-microsoft-com:office:office" xmlns:oel="http://schemas.microsoft.com/office/2019/extlst" xmlns:r="http://schemas.openxmlformats.org/officeDocument/2006/relationships" xmlns:m="http://schemas.openxmlformats.org/officeDocument/2006/math" xmlns:v="urn:schemas-microsoft-com:vml" xmlns:wp14="http://schemas.microsoft.com/office/word/2010/wordprocessingDrawing" xmlns:wp="http://schemas.openxmlformats.org/drawingml/2006/wordprocessingDrawing" xmlns:w10="urn:schemas-microsoft-com:office:word" xmlns:w="http://schemas.openxmlformats.org/wordprocessingml/2006/main" xmlns:w14="http://schemas.microsoft.com/office/word/2010/wordml" xmlns:w15="http://schemas.microsoft.com/office/word/2012/wordml" xmlns:w16cex="http://schemas.microsoft.com/office/word/2018/wordml/cex" xmlns:w16cid="http://schemas.microsoft.com/office/word/2016/wordml/cid" xmlns:w16="http://schemas.microsoft.com/office/word/2018/wordml" xmlns:w16du="http://schemas.microsoft.com/office/word/2023/wordml/word16du" xmlns:w16sdtdh="http://schemas.microsoft.com/office/word/2020/wordml/sdtdatahash" xmlns:w16sdtfl="http://schemas.microsoft.com/office/word/2024/wordml/sdtformatlock" xmlns:w16se="http://schemas.microsoft.com/office/word/2015/wordml/symex" xmlns:wpg="http://schemas.microsoft.com/office/word/2010/wordprocessingGroup" xmlns:wpi="http://schemas.microsoft.com/office/word/2010/wordprocessingInk" xmlns:wne="http://schemas.microsoft.com/office/word/2006/wordml" xmlns:wps="http://schemas.microsoft.com/office/word/2010/wordprocessingShape" mc:Ignorable="w14 w15 w16se w16cid w16 w16cex w16sdtdh w16sdtfl w16du wp14">
-  <w:p>
-    <w:pPr>
-      <w:pStyle w:val="Encabezado"/>
-    </w:pPr>
-  </w:p>
-</w:hdr>
-</file>
-
 <file path=word/numbering.xml><?xml version="1.0" encoding="utf-8"?>
-<w:numbering xmlns:wpc="http://schemas.microsoft.com/office/word/2010/wordprocessingCanvas" xmlns:cx="http://schemas.microsoft.com/office/drawing/2014/chartex" xmlns:cx1="http://schemas.microsoft.com/office/drawing/2015/9/8/chartex" xmlns:cx2="http://schemas.microsoft.com/office/drawing/2015/10/21/chartex" xmlns:cx3="http://schemas.microsoft.com/office/drawing/2016/5/9/chartex" xmlns:cx4="http://schemas.microsoft.com/office/drawing/2016/5/10/chartex" xmlns:cx5="http://schemas.microsoft.com/office/drawing/2016/5/11/chartex" xmlns:cx6="http://schemas.microsoft.com/office/drawing/2016/5/12/chartex" xmlns:cx7="http://schemas.microsoft.com/office/drawing/2016/5/13/chartex" xmlns:cx8="http://schemas.microsoft.com/office/drawing/2016/5/14/chartex" xmlns:mc="http://schemas.openxmlformats.org/markup-compatibility/2006" xmlns:aink="http://schemas.microsoft.com/office/drawing/2016/ink" xmlns:am3d="http://schemas.microsoft.com/office/drawing/2017/model3d" xmlns:o="urn:schemas-microsoft-com:office:office" xmlns:oel="http://schemas.microsoft.com/office/2019/extlst" xmlns:r="http://schemas.openxmlformats.org/officeDocument/2006/relationships" xmlns:m="http://schemas.openxmlformats.org/officeDocument/2006/math" xmlns:v="urn:schemas-microsoft-com:vml" xmlns:wp14="http://schemas.microsoft.com/office/word/2010/wordprocessingDrawing" xmlns:wp="http://schemas.openxmlformats.org/drawingml/2006/wordprocessingDrawing" xmlns:w10="urn:schemas-microsoft-com:office:word" xmlns:w="http://schemas.openxmlformats.org/wordprocessingml/2006/main" xmlns:w14="http://schemas.microsoft.com/office/word/2010/wordml" xmlns:w15="http://schemas.microsoft.com/office/word/2012/wordml" xmlns:w16cex="http://schemas.microsoft.com/office/word/2018/wordml/cex" xmlns:w16cid="http://schemas.microsoft.com/office/word/2016/wordml/cid" xmlns:w16="http://schemas.microsoft.com/office/word/2018/wordml" xmlns:w16du="http://schemas.microsoft.com/office/word/2023/wordml/word16du" xmlns:w16sdtdh="http://schemas.microsoft.com/office/word/2020/wordml/sdtdatahash" xmlns:w16sdtfl="http://schemas.microsoft.com/office/word/2024/wordml/sdtformatlock" xmlns:w16se="http://schemas.microsoft.com/office/word/2015/wordml/symex" xmlns:wpg="http://schemas.microsoft.com/office/word/2010/wordprocessingGroup" xmlns:wpi="http://schemas.microsoft.com/office/word/2010/wordprocessingInk" xmlns:wne="http://schemas.microsoft.com/office/word/2006/wordml" xmlns:wps="http://schemas.microsoft.com/office/word/2010/wordprocessingShape" mc:Ignorable="w14 w15 w16se w16cid w16 w16cex w16sdtdh w16sdtfl w16du wp14">
+<w:numbering xmlns:wpc="http://schemas.microsoft.com/office/word/2010/wordprocessingCanvas" xmlns:cx="http://schemas.microsoft.com/office/drawing/2014/chartex" xmlns:cx1="http://schemas.microsoft.com/office/drawing/2015/9/8/chartex" xmlns:cx2="http://schemas.microsoft.com/office/drawing/2015/10/21/chartex" xmlns:cx3="http://schemas.microsoft.com/office/drawing/2016/5/9/chartex" xmlns:cx4="http://schemas.microsoft.com/office/drawing/2016/5/10/chartex" xmlns:cx5="http://schemas.microsoft.com/office/drawing/2016/5/11/chartex" xmlns:cx6="http://schemas.microsoft.com/office/drawing/2016/5/12/chartex" xmlns:cx7="http://schemas.microsoft.com/office/drawing/2016/5/13/chartex" xmlns:cx8="http://schemas.microsoft.com/office/drawing/2016/5/14/chartex" xmlns:mc="http://schemas.openxmlformats.org/markup-compatibility/2006" xmlns:aink="http://schemas.microsoft.com/office/drawing/2016/ink" xmlns:am3d="http://schemas.microsoft.com/office/drawing/2017/model3d" xmlns:o="urn:schemas-microsoft-com:office:office" xmlns:r="http://schemas.openxmlformats.org/officeDocument/2006/relationships" xmlns:m="http://schemas.openxmlformats.org/officeDocument/2006/math" xmlns:v="urn:schemas-microsoft-com:vml" xmlns:wp14="http://schemas.microsoft.com/office/word/2010/wordprocessingDrawing" xmlns:wp="http://schemas.openxmlformats.org/drawingml/2006/wordprocessingDrawing" xmlns:w10="urn:schemas-microsoft-com:office:word" xmlns:w="http://schemas.openxmlformats.org/wordprocessingml/2006/main" xmlns:w14="http://schemas.microsoft.com/office/word/2010/wordml" xmlns:w15="http://schemas.microsoft.com/office/word/2012/wordml" xmlns:w16cex="http://schemas.microsoft.com/office/word/2018/wordml/cex" xmlns:w16cid="http://schemas.microsoft.com/office/word/2016/wordml/cid" xmlns:w16="http://schemas.microsoft.com/office/word/2018/wordml" xmlns:w16sdtdh="http://schemas.microsoft.com/office/word/2020/wordml/sdtdatahash" xmlns:w16se="http://schemas.microsoft.com/office/word/2015/wordml/symex" xmlns:wpg="http://schemas.microsoft.com/office/word/2010/wordprocessingGroup" xmlns:wpi="http://schemas.microsoft.com/office/word/2010/wordprocessingInk" xmlns:wne="http://schemas.microsoft.com/office/word/2006/wordml" xmlns:wps="http://schemas.microsoft.com/office/word/2010/wordprocessingShape" mc:Ignorable="w14 w15 w16se w16cid w16 w16cex w16sdtdh wp14">
   <w:abstractNum w:abstractNumId="0" w15:restartNumberingAfterBreak="0">
     <w:nsid w:val="00000001"/>
     <w:multiLevelType w:val="multilevel"/>
@@ -5186,14 +4628,14 @@
       </w:pPr>
     </w:lvl>
   </w:abstractNum>
-  <w:num w:numId="1" w16cid:durableId="1686708418">
+  <w:num w:numId="1">
     <w:abstractNumId w:val="0"/>
   </w:num>
 </w:numbering>
 </file>
 
 <file path=word/styles.xml><?xml version="1.0" encoding="utf-8"?>
-<w:styles xmlns:mc="http://schemas.openxmlformats.org/markup-compatibility/2006" xmlns:r="http://schemas.openxmlformats.org/officeDocument/2006/relationships" xmlns:w="http://schemas.openxmlformats.org/wordprocessingml/2006/main" xmlns:w14="http://schemas.microsoft.com/office/word/2010/wordml" xmlns:w15="http://schemas.microsoft.com/office/word/2012/wordml" xmlns:w16cex="http://schemas.microsoft.com/office/word/2018/wordml/cex" xmlns:w16cid="http://schemas.microsoft.com/office/word/2016/wordml/cid" xmlns:w16="http://schemas.microsoft.com/office/word/2018/wordml" xmlns:w16du="http://schemas.microsoft.com/office/word/2023/wordml/word16du" xmlns:w16sdtdh="http://schemas.microsoft.com/office/word/2020/wordml/sdtdatahash" xmlns:w16sdtfl="http://schemas.microsoft.com/office/word/2024/wordml/sdtformatlock" xmlns:w16se="http://schemas.microsoft.com/office/word/2015/wordml/symex" mc:Ignorable="w14 w15 w16se w16cid w16 w16cex w16sdtdh w16sdtfl w16du">
+<w:styles xmlns:mc="http://schemas.openxmlformats.org/markup-compatibility/2006" xmlns:r="http://schemas.openxmlformats.org/officeDocument/2006/relationships" xmlns:w="http://schemas.openxmlformats.org/wordprocessingml/2006/main" xmlns:w14="http://schemas.microsoft.com/office/word/2010/wordml" xmlns:w15="http://schemas.microsoft.com/office/word/2012/wordml" xmlns:w16cex="http://schemas.microsoft.com/office/word/2018/wordml/cex" xmlns:w16cid="http://schemas.microsoft.com/office/word/2016/wordml/cid" xmlns:w16="http://schemas.microsoft.com/office/word/2018/wordml" xmlns:w16sdtdh="http://schemas.microsoft.com/office/word/2020/wordml/sdtdatahash" xmlns:w16se="http://schemas.microsoft.com/office/word/2015/wordml/symex" mc:Ignorable="w14 w15 w16se w16cid w16 w16cex w16sdtdh">
   <w:docDefaults>
     <w:rPrDefault>
       <w:rPr>
@@ -5236,7 +4678,7 @@
     <w:lsdException w:name="footnote text" w:semiHidden="1" w:unhideWhenUsed="1"/>
     <w:lsdException w:name="annotation text" w:semiHidden="1" w:unhideWhenUsed="1"/>
     <w:lsdException w:name="header" w:semiHidden="1" w:unhideWhenUsed="1"/>
-    <w:lsdException w:name="footer" w:semiHidden="1" w:unhideWhenUsed="1"/>
+    <w:lsdException w:name="footer" w:semiHidden="1" w:unhideWhenUsed="1" w:qFormat="1"/>
     <w:lsdException w:name="index heading" w:semiHidden="1" w:unhideWhenUsed="1"/>
     <w:lsdException w:name="caption" w:semiHidden="1" w:uiPriority="35" w:unhideWhenUsed="1" w:qFormat="1"/>
     <w:lsdException w:name="table of figures" w:semiHidden="1" w:unhideWhenUsed="1"/>
@@ -6767,6 +6209,7 @@
   <w:style w:type="paragraph" w:styleId="Piedepgina">
     <w:name w:val="footer"/>
     <w:basedOn w:val="Normal"/>
+    <w:qFormat/>
   </w:style>
   <w:style w:type="paragraph" w:styleId="NormalWeb">
     <w:name w:val="Normal (Web)"/>

</xml_diff>